<commit_message>
paper/docs: LunarLander 기준선 발견을 논문·README 서사에 반영
Ⅰ장·Ⅴ장·README가 아직 '학습을 쓰라'는 옛 결론을 담고 있었다. 새 서사:
  · 학습 쪽 의심(예산 3.3배) → 결론 그대로
  · 규칙 쪽 의심(계수 재선택) → 기준선 38.3 → 179.8, λ*가 절반, TempoRL은 아예 못 이김
  → '학습이 규칙을 이기는가'의 답은 양쪽을 각각 얼마나 잘 만들었는지에 달려 있다

Ⅴ장 기여를 넷 → 다섯 가지로 늘리고, 실무 지침에 '비교 상대인 규칙에도 공을 들여라'를 추가했다.
Lazy-MDP의 기본 정책을 튜닝 규칙으로 바꾼 변종(2.2시간)을 대기열에 넣었다 —
지금 Lazy 성적은 약한 기본 정책 위에서 난 것이라 하한이기 때문이다.
</commit_message>
<xml_diff>
--- a/졸업논문_초안v1.docx
+++ b/졸업논문_초안v1.docx
@@ -698,7 +698,77 @@
           <w:i w:val="0"/>
           <w:sz w:val="20"/>
         </w:rPr>
-        <w:t xml:space="preserve"> — 였다. 보상이 희소하고 좋은 규칙이 있는 MountainCar에서는 비용이 0일 때조차 학습이 규칙을 넘어서지 못했고, 보상이 조밀한 LunarLander에서는 행동이 상당히 비싸질 때까지 학습이 규칙을 이겼다. 구체적인 λ* 값은 Ⅳ장 표 1에 있다.</w:t>
+        <w:t xml:space="preserve"> — 였다. 보상이 희소하고 좋은 규칙이 있는 MountainCar에서는 비용이 0일 때조차 학습이 규칙을 넘어서지 못했고, 보상이 조밀한 LunarLander에서는 학습이 규칙을 이기되 </w:t>
+      </w:r>
+      <w:r>
+        <w:rPr>
+          <w:rFonts w:ascii="바탕" w:hAnsi="바탕" w:eastAsia="바탕"/>
+          <w:b/>
+          <w:i w:val="0"/>
+          <w:sz w:val="20"/>
+        </w:rPr>
+        <w:t>어느 방법이냐에 따라 이기는 구간이 크게 달랐다.</w:t>
+      </w:r>
+      <w:r>
+        <w:rPr>
+          <w:rFonts w:ascii="바탕" w:hAnsi="바탕" w:eastAsia="바탕"/>
+          <w:b w:val="0"/>
+          <w:i w:val="0"/>
+          <w:sz w:val="20"/>
+        </w:rPr>
+        <w:t xml:space="preserve"> 구체적인 λ* 값은 Ⅳ장 표 1에 있다.</w:t>
+      </w:r>
+    </w:p>
+    <w:p>
+      <w:pPr>
+        <w:spacing w:line="480" w:lineRule="auto" w:before="0" w:after="0"/>
+        <w:ind w:firstLine="200"/>
+        <w:jc w:val="both"/>
+      </w:pPr>
+      <w:r>
+        <w:rPr>
+          <w:rFonts w:ascii="바탕" w:hAnsi="바탕" w:eastAsia="바탕"/>
+          <w:b w:val="0"/>
+          <w:i w:val="0"/>
+          <w:sz w:val="20"/>
+        </w:rPr>
+        <w:t xml:space="preserve">그리고 이 연구가 스스로에게 걸었던 두 검사에서 예상 밖의 것이 나왔다. 학습 쪽을 의심해 예산을 3.3배로 늘려도 MountainCar의 결론은 그대로였고, 반대로 </w:t>
+      </w:r>
+      <w:r>
+        <w:rPr>
+          <w:rFonts w:ascii="바탕" w:hAnsi="바탕" w:eastAsia="바탕"/>
+          <w:b/>
+          <w:i w:val="0"/>
+          <w:sz w:val="20"/>
+        </w:rPr>
+        <w:t>규칙 쪽을 의심해 계수를 튜닝하자 LunarLander의 기준선이 38.3점에서 179.8점으로 뛰었다.</w:t>
+      </w:r>
+      <w:r>
+        <w:rPr>
+          <w:rFonts w:ascii="바탕" w:hAnsi="바탕" w:eastAsia="바탕"/>
+          <w:b w:val="0"/>
+          <w:i w:val="0"/>
+          <w:sz w:val="20"/>
+        </w:rPr>
+        <w:t xml:space="preserve"> 그 결과 λ*가 절반으로 줄고, 한 방법은 아예 규칙을 이기지 못하게 되었다. 즉 </w:t>
+      </w:r>
+      <w:r>
+        <w:rPr>
+          <w:rFonts w:ascii="바탕" w:hAnsi="바탕" w:eastAsia="바탕"/>
+          <w:b/>
+          <w:i w:val="0"/>
+          <w:sz w:val="20"/>
+        </w:rPr>
+        <w:t>"학습이 규칙을 이기는가"라는 질문의 답은 양쪽을 각각 얼마나 잘 만들었는지에 달려 있다.</w:t>
+      </w:r>
+      <w:r>
+        <w:rPr>
+          <w:rFonts w:ascii="바탕" w:hAnsi="바탕" w:eastAsia="바탕"/>
+          <w:b w:val="0"/>
+          <w:i w:val="0"/>
+          <w:sz w:val="20"/>
+        </w:rPr>
+        <w:t xml:space="preserve"> 이것을 밝히지 않은 비교는 믿을 수 없다.</w:t>
       </w:r>
     </w:p>
     <w:p>
@@ -4903,7 +4973,7 @@
                 <w:i w:val="0"/>
                 <w:sz w:val="18"/>
               </w:rPr>
-              <w:t>5</w:t>
+              <w:t>7</w:t>
             </w:r>
           </w:p>
         </w:tc>
@@ -5045,7 +5115,7 @@
                 <w:i w:val="0"/>
                 <w:sz w:val="18"/>
               </w:rPr>
-              <w:t>5</w:t>
+              <w:t>7</w:t>
             </w:r>
           </w:p>
         </w:tc>
@@ -5187,7 +5257,7 @@
                 <w:i w:val="0"/>
                 <w:sz w:val="18"/>
               </w:rPr>
-              <w:t>5</w:t>
+              <w:t>7</w:t>
             </w:r>
           </w:p>
         </w:tc>
@@ -5289,7 +5359,7 @@
                 <w:i w:val="0"/>
                 <w:sz w:val="18"/>
               </w:rPr>
-              <w:t>2</w:t>
+              <w:t>0.1</w:t>
             </w:r>
           </w:p>
         </w:tc>
@@ -5309,7 +5379,7 @@
                 <w:i w:val="0"/>
                 <w:sz w:val="18"/>
               </w:rPr>
-              <w:t>2</w:t>
+              <w:t>1</w:t>
             </w:r>
           </w:p>
         </w:tc>
@@ -5431,7 +5501,7 @@
                 <w:i w:val="0"/>
                 <w:sz w:val="18"/>
               </w:rPr>
-              <w:t>1</w:t>
+              <w:t>0</w:t>
             </w:r>
           </w:p>
         </w:tc>
@@ -5451,7 +5521,7 @@
                 <w:i w:val="0"/>
                 <w:sz w:val="18"/>
               </w:rPr>
-              <w:t>2</w:t>
+              <w:t>0</w:t>
             </w:r>
           </w:p>
         </w:tc>
@@ -5573,7 +5643,7 @@
                 <w:i w:val="0"/>
                 <w:sz w:val="18"/>
               </w:rPr>
-              <w:t>2</w:t>
+              <w:t>0.6</w:t>
             </w:r>
           </w:p>
         </w:tc>
@@ -6250,7 +6320,7 @@
                 <w:i w:val="0"/>
                 <w:sz w:val="18"/>
               </w:rPr>
-              <w:t>noop, periodic_k1, periodic_k2, periodic_k4, periodic_k8, threshold</w:t>
+              <w:t>noop, periodic_k1, periodic_k2, periodic_k4, periodic_k8, threshold, threshold_tuned</w:t>
             </w:r>
           </w:p>
         </w:tc>
@@ -6884,7 +6954,7 @@
           <w:i w:val="0"/>
           <w:sz w:val="20"/>
         </w:rPr>
-        <w:t xml:space="preserve">보상이 희소한 탐험 문제다. 목표에 닿기 전까지 아무 신호가 없고, 매 스텝 무작위로 행동하는 탐험으로는 목표에 한 번도 닿지 못한다. 학습 없이도 문제를 푸는 강한 고정 규칙(pump)이 존재한다. 조건당 환경 300,000스텝, 학습 계열은 λ 14개(격자 14개 중) · 시드 5~10개까지 완료된 집계다. </w:t>
+        <w:t xml:space="preserve">보상이 희소한 탐험 문제다. 목표에 닿기 전까지 아무 신호가 없고, 매 스텝 무작위로 행동하는 탐험으로는 목표에 한 번도 닿지 못한다. 학습 없이도 문제를 푸는 강한 고정 규칙(pump)이 존재한다. 조건당 환경 300,000스텝, 학습 계열은 λ 14개(격자 14개 중) · 시드 7~10개까지 완료된 집계다. </w:t>
       </w:r>
       <w:r>
         <w:rPr>
@@ -7234,7 +7304,7 @@
                 <w:i w:val="0"/>
                 <w:sz w:val="18"/>
               </w:rPr>
-              <w:t>-164 [-200, -124]</w:t>
+              <w:t>-163 [-194, -132]</w:t>
             </w:r>
           </w:p>
         </w:tc>
@@ -7254,7 +7324,7 @@
                 <w:i w:val="0"/>
                 <w:sz w:val="18"/>
               </w:rPr>
-              <w:t>-156 [-193, -125]</w:t>
+              <w:t>-147 [-176, -129]</w:t>
             </w:r>
           </w:p>
         </w:tc>
@@ -7274,7 +7344,7 @@
                 <w:i w:val="0"/>
                 <w:sz w:val="18"/>
               </w:rPr>
-              <w:t>-179 [-200, -136]</w:t>
+              <w:t>-158 [-188, -130]</w:t>
             </w:r>
           </w:p>
         </w:tc>
@@ -7356,7 +7426,7 @@
                 <w:i w:val="0"/>
                 <w:sz w:val="18"/>
               </w:rPr>
-              <w:t>-139 [-180, -121]</w:t>
+              <w:t>-163 [-191, -132]</w:t>
             </w:r>
           </w:p>
         </w:tc>
@@ -7376,7 +7446,7 @@
                 <w:i w:val="0"/>
                 <w:sz w:val="18"/>
               </w:rPr>
-              <w:t>-171 [-200, -133]</w:t>
+              <w:t>-175 [-200, -148]</w:t>
             </w:r>
           </w:p>
         </w:tc>
@@ -7396,7 +7466,7 @@
                 <w:i w:val="0"/>
                 <w:sz w:val="18"/>
               </w:rPr>
-              <w:t>-151 [-173, -118]</w:t>
+              <w:t>-149 [-167, -129]</w:t>
             </w:r>
           </w:p>
         </w:tc>
@@ -7478,7 +7548,7 @@
                 <w:i w:val="0"/>
                 <w:sz w:val="18"/>
               </w:rPr>
-              <w:t>-181 [-200, -147]</w:t>
+              <w:t>-163 [-192, -133]</w:t>
             </w:r>
           </w:p>
         </w:tc>
@@ -7498,7 +7568,7 @@
                 <w:i w:val="0"/>
                 <w:sz w:val="18"/>
               </w:rPr>
-              <w:t>-144 [-182, -129]</w:t>
+              <w:t>-161 [-187, -137]</w:t>
             </w:r>
           </w:p>
         </w:tc>
@@ -7518,7 +7588,7 @@
                 <w:i w:val="0"/>
                 <w:sz w:val="18"/>
               </w:rPr>
-              <w:t>-160 [-192, -119]</w:t>
+              <w:t>-142 [-179, -114]</w:t>
             </w:r>
           </w:p>
         </w:tc>
@@ -7600,7 +7670,7 @@
                 <w:i w:val="0"/>
                 <w:sz w:val="18"/>
               </w:rPr>
-              <w:t>-167 [-201, -129]</w:t>
+              <w:t>-166 [-200, -130]</w:t>
             </w:r>
           </w:p>
         </w:tc>
@@ -7620,7 +7690,7 @@
                 <w:i w:val="0"/>
                 <w:sz w:val="18"/>
               </w:rPr>
-              <w:t>-149 [-188, -125]</w:t>
+              <w:t>-143 [-170, -129]</w:t>
             </w:r>
           </w:p>
         </w:tc>
@@ -7640,7 +7710,7 @@
                 <w:i w:val="0"/>
                 <w:sz w:val="18"/>
               </w:rPr>
-              <w:t>-130 [-180, -124]</w:t>
+              <w:t>-137 [-170, -121]</w:t>
             </w:r>
           </w:p>
         </w:tc>
@@ -7722,7 +7792,7 @@
                 <w:i w:val="0"/>
                 <w:sz w:val="18"/>
               </w:rPr>
-              <w:t>-200 [-201, -189]</w:t>
+              <w:t>-197 [-201, -165]</w:t>
             </w:r>
           </w:p>
         </w:tc>
@@ -7742,7 +7812,7 @@
                 <w:i w:val="0"/>
                 <w:sz w:val="18"/>
               </w:rPr>
-              <w:t>-181 [-200, -156]</w:t>
+              <w:t>-179 [-200, -158]</w:t>
             </w:r>
           </w:p>
         </w:tc>
@@ -7762,7 +7832,7 @@
                 <w:i w:val="0"/>
                 <w:sz w:val="18"/>
               </w:rPr>
-              <w:t>-200 [-201, -156]</w:t>
+              <w:t>-176 [-201, -144]</w:t>
             </w:r>
           </w:p>
         </w:tc>
@@ -9331,7 +9401,7 @@
                 <w:i w:val="0"/>
                 <w:sz w:val="18"/>
               </w:rPr>
-              <w:t>150</w:t>
+              <w:t>139</w:t>
             </w:r>
           </w:p>
         </w:tc>
@@ -9413,7 +9483,7 @@
                 <w:i w:val="0"/>
                 <w:sz w:val="18"/>
               </w:rPr>
-              <w:t>130</w:t>
+              <w:t>127</w:t>
             </w:r>
           </w:p>
         </w:tc>
@@ -9433,7 +9503,7 @@
                 <w:i w:val="0"/>
                 <w:sz w:val="18"/>
               </w:rPr>
-              <w:t>131</w:t>
+              <w:t>135</w:t>
             </w:r>
           </w:p>
         </w:tc>
@@ -9453,7 +9523,7 @@
                 <w:i w:val="0"/>
                 <w:sz w:val="18"/>
               </w:rPr>
-              <w:t>129</w:t>
+              <w:t>135</w:t>
             </w:r>
           </w:p>
         </w:tc>
@@ -9535,7 +9605,7 @@
                 <w:i w:val="0"/>
                 <w:sz w:val="18"/>
               </w:rPr>
-              <w:t>102</w:t>
+              <w:t>108</w:t>
             </w:r>
           </w:p>
         </w:tc>
@@ -9555,7 +9625,7 @@
                 <w:i w:val="0"/>
                 <w:sz w:val="18"/>
               </w:rPr>
-              <w:t>121</w:t>
+              <w:t>125</w:t>
             </w:r>
           </w:p>
         </w:tc>
@@ -9575,7 +9645,7 @@
                 <w:i w:val="0"/>
                 <w:sz w:val="18"/>
               </w:rPr>
-              <w:t>148</w:t>
+              <w:t>135</w:t>
             </w:r>
           </w:p>
         </w:tc>
@@ -9657,7 +9727,7 @@
                 <w:i w:val="0"/>
                 <w:sz w:val="18"/>
               </w:rPr>
-              <w:t>126</w:t>
+              <w:t>114</w:t>
             </w:r>
           </w:p>
         </w:tc>
@@ -9677,7 +9747,7 @@
                 <w:i w:val="0"/>
                 <w:sz w:val="18"/>
               </w:rPr>
-              <w:t>127</w:t>
+              <w:t>128</w:t>
             </w:r>
           </w:p>
         </w:tc>
@@ -9697,7 +9767,7 @@
                 <w:i w:val="0"/>
                 <w:sz w:val="18"/>
               </w:rPr>
-              <w:t>122</w:t>
+              <w:t>123</w:t>
             </w:r>
           </w:p>
         </w:tc>
@@ -9779,7 +9849,7 @@
                 <w:i w:val="0"/>
                 <w:sz w:val="18"/>
               </w:rPr>
-              <w:t>105</w:t>
+              <w:t>112</w:t>
             </w:r>
           </w:p>
         </w:tc>
@@ -9799,7 +9869,7 @@
                 <w:i w:val="0"/>
                 <w:sz w:val="18"/>
               </w:rPr>
-              <w:t>124</w:t>
+              <w:t>136</w:t>
             </w:r>
           </w:p>
         </w:tc>
@@ -9819,7 +9889,7 @@
                 <w:i w:val="0"/>
                 <w:sz w:val="18"/>
               </w:rPr>
-              <w:t>66</w:t>
+              <w:t>89</w:t>
             </w:r>
           </w:p>
         </w:tc>
@@ -10875,7 +10945,16 @@
           <w:i w:val="0"/>
           <w:sz w:val="20"/>
         </w:rPr>
-        <w:t>보상이 조밀한 제어 문제다. 매 스텝 자세·속도·연료에 대한 신호가 들어오고, 표준 DQN이 정상적으로 학습된다. 고정 규칙은 착륙은 시키지만 점수가 낮다. 조건당 환경 200,000스텝, 학습 계열은 λ 8개(격자 8개 중) · 시드 10개까지 완료된 집계다.</w:t>
+        <w:t xml:space="preserve">보상이 조밀한 제어 문제다. 매 스텝 자세·속도·연료에 대한 신호가 들어오고, 표준 DQN이 정상적으로 학습된다. 고정 규칙은 착륙은 시키지만 점수가 낮다. 조건당 환경 200,000스텝, 학습 계열은 λ 8개(격자 12개 중) · 시드 10개까지 완료된 집계다. </w:t>
+      </w:r>
+      <w:r>
+        <w:rPr>
+          <w:rFonts w:ascii="바탕" w:hAnsi="바탕" w:eastAsia="바탕"/>
+          <w:b/>
+          <w:i w:val="0"/>
+          <w:sz w:val="20"/>
+        </w:rPr>
+        <w:t>아직 실험이 끝나지 않았으므로 최종 결론이 아니다.</w:t>
       </w:r>
     </w:p>
     <w:p>
@@ -11031,7 +11110,7 @@
                 <w:i w:val="0"/>
                 <w:sz w:val="18"/>
               </w:rPr>
-              <w:t>임계값 규칙</w:t>
+              <w:t>임계값 규칙(처음)</w:t>
             </w:r>
           </w:p>
         </w:tc>
@@ -11237,7 +11316,7 @@
                 <w:i w:val="0"/>
                 <w:sz w:val="18"/>
               </w:rPr>
-              <w:t xml:space="preserve">36 </w:t>
+              <w:t xml:space="preserve">162 </w:t>
             </w:r>
             <w:r>
               <w:rPr>
@@ -11247,7 +11326,7 @@
                 <w:sz w:val="18"/>
                 <w:vertAlign w:val="superscript"/>
               </w:rPr>
-              <w:t>[34, 38]</w:t>
+              <w:t>[157, 168]</w:t>
             </w:r>
           </w:p>
         </w:tc>
@@ -11429,7 +11508,7 @@
                 <w:i w:val="0"/>
                 <w:sz w:val="18"/>
               </w:rPr>
-              <w:t xml:space="preserve">24 </w:t>
+              <w:t xml:space="preserve">146 </w:t>
             </w:r>
             <w:r>
               <w:rPr>
@@ -11439,7 +11518,7 @@
                 <w:sz w:val="18"/>
                 <w:vertAlign w:val="superscript"/>
               </w:rPr>
-              <w:t>[22, 25]</w:t>
+              <w:t>[141, 151]</w:t>
             </w:r>
           </w:p>
         </w:tc>
@@ -11611,7 +11690,17 @@
                 <w:i w:val="0"/>
                 <w:sz w:val="18"/>
               </w:rPr>
-              <w:t>-1 [-2, 1]</w:t>
+              <w:t xml:space="preserve">114 </w:t>
+            </w:r>
+            <w:r>
+              <w:rPr>
+                <w:rFonts w:ascii="바탕" w:hAnsi="바탕" w:eastAsia="바탕"/>
+                <w:b w:val="0"/>
+                <w:i w:val="0"/>
+                <w:sz w:val="18"/>
+                <w:vertAlign w:val="superscript"/>
+              </w:rPr>
+              <w:t>[108, 118]</w:t>
             </w:r>
           </w:p>
         </w:tc>
@@ -11773,7 +11862,17 @@
                 <w:i w:val="0"/>
                 <w:sz w:val="18"/>
               </w:rPr>
-              <w:t>-37 [-39, -35]</w:t>
+              <w:t xml:space="preserve">65 </w:t>
+            </w:r>
+            <w:r>
+              <w:rPr>
+                <w:rFonts w:ascii="바탕" w:hAnsi="바탕" w:eastAsia="바탕"/>
+                <w:b w:val="0"/>
+                <w:i w:val="0"/>
+                <w:sz w:val="18"/>
+                <w:vertAlign w:val="superscript"/>
+              </w:rPr>
+              <w:t>[60, 69]</w:t>
             </w:r>
           </w:p>
         </w:tc>
@@ -11915,7 +12014,7 @@
                 <w:i w:val="0"/>
                 <w:sz w:val="18"/>
               </w:rPr>
-              <w:t>-86 [-87, -84]</w:t>
+              <w:t>-1 [-7, 5]</w:t>
             </w:r>
           </w:p>
         </w:tc>
@@ -11957,7 +12056,7 @@
                 <w:i w:val="0"/>
                 <w:sz w:val="18"/>
               </w:rPr>
-              <w:t>1.37</w:t>
+              <w:t>1.2</w:t>
             </w:r>
           </w:p>
         </w:tc>
@@ -11977,7 +12076,7 @@
                 <w:i w:val="0"/>
                 <w:sz w:val="18"/>
               </w:rPr>
-              <w:t>-61 [-86, -34]</w:t>
+              <w:t>—</w:t>
             </w:r>
           </w:p>
         </w:tc>
@@ -11997,7 +12096,7 @@
                 <w:i w:val="0"/>
                 <w:sz w:val="18"/>
               </w:rPr>
-              <w:t>-52 [-98, -7]</w:t>
+              <w:t>—</w:t>
             </w:r>
           </w:p>
         </w:tc>
@@ -12017,7 +12116,7 @@
                 <w:i w:val="0"/>
                 <w:sz w:val="18"/>
               </w:rPr>
-              <w:t>-47 [-68, -26]</w:t>
+              <w:t>—</w:t>
             </w:r>
           </w:p>
         </w:tc>
@@ -12037,7 +12136,7 @@
                 <w:i w:val="0"/>
                 <w:sz w:val="18"/>
               </w:rPr>
-              <w:t>-131 [-133, -129]</w:t>
+              <w:t>-110 [-112, -108]</w:t>
             </w:r>
           </w:p>
         </w:tc>
@@ -12057,7 +12156,7 @@
                 <w:i w:val="0"/>
                 <w:sz w:val="18"/>
               </w:rPr>
-              <w:t>-131 [-133, -129]</w:t>
+              <w:t>-33 [-40, -27]</w:t>
             </w:r>
           </w:p>
         </w:tc>
@@ -12099,6 +12198,432 @@
                 <w:i w:val="0"/>
                 <w:sz w:val="18"/>
               </w:rPr>
+              <w:t>1.37</w:t>
+            </w:r>
+          </w:p>
+        </w:tc>
+        <w:tc>
+          <w:tcPr>
+            <w:tcW w:type="dxa" w:w="1296"/>
+          </w:tcPr>
+          <w:p>
+            <w:pPr>
+              <w:spacing w:line="240" w:lineRule="auto"/>
+              <w:jc w:val="center"/>
+            </w:pPr>
+            <w:r>
+              <w:rPr>
+                <w:rFonts w:ascii="바탕" w:hAnsi="바탕" w:eastAsia="바탕"/>
+                <w:b w:val="0"/>
+                <w:i w:val="0"/>
+                <w:sz w:val="18"/>
+              </w:rPr>
+              <w:t>-61 [-86, -34]</w:t>
+            </w:r>
+          </w:p>
+        </w:tc>
+        <w:tc>
+          <w:tcPr>
+            <w:tcW w:type="dxa" w:w="1296"/>
+          </w:tcPr>
+          <w:p>
+            <w:pPr>
+              <w:spacing w:line="240" w:lineRule="auto"/>
+              <w:jc w:val="center"/>
+            </w:pPr>
+            <w:r>
+              <w:rPr>
+                <w:rFonts w:ascii="바탕" w:hAnsi="바탕" w:eastAsia="바탕"/>
+                <w:b w:val="0"/>
+                <w:i w:val="0"/>
+                <w:sz w:val="18"/>
+              </w:rPr>
+              <w:t>-52 [-98, -7]</w:t>
+            </w:r>
+          </w:p>
+        </w:tc>
+        <w:tc>
+          <w:tcPr>
+            <w:tcW w:type="dxa" w:w="1296"/>
+          </w:tcPr>
+          <w:p>
+            <w:pPr>
+              <w:spacing w:line="240" w:lineRule="auto"/>
+              <w:jc w:val="center"/>
+            </w:pPr>
+            <w:r>
+              <w:rPr>
+                <w:rFonts w:ascii="바탕" w:hAnsi="바탕" w:eastAsia="바탕"/>
+                <w:b w:val="0"/>
+                <w:i w:val="0"/>
+                <w:sz w:val="18"/>
+              </w:rPr>
+              <w:t>-47 [-68, -26]</w:t>
+            </w:r>
+          </w:p>
+        </w:tc>
+        <w:tc>
+          <w:tcPr>
+            <w:tcW w:type="dxa" w:w="1296"/>
+          </w:tcPr>
+          <w:p>
+            <w:pPr>
+              <w:spacing w:line="240" w:lineRule="auto"/>
+              <w:jc w:val="center"/>
+            </w:pPr>
+            <w:r>
+              <w:rPr>
+                <w:rFonts w:ascii="바탕" w:hAnsi="바탕" w:eastAsia="바탕"/>
+                <w:b w:val="0"/>
+                <w:i w:val="0"/>
+                <w:sz w:val="18"/>
+              </w:rPr>
+              <w:t>-131 [-133, -129]</w:t>
+            </w:r>
+          </w:p>
+        </w:tc>
+        <w:tc>
+          <w:tcPr>
+            <w:tcW w:type="dxa" w:w="1296"/>
+          </w:tcPr>
+          <w:p>
+            <w:pPr>
+              <w:spacing w:line="240" w:lineRule="auto"/>
+              <w:jc w:val="center"/>
+            </w:pPr>
+            <w:r>
+              <w:rPr>
+                <w:rFonts w:ascii="바탕" w:hAnsi="바탕" w:eastAsia="바탕"/>
+                <w:b w:val="0"/>
+                <w:i w:val="0"/>
+                <w:sz w:val="18"/>
+              </w:rPr>
+              <w:t>-61 [-68, -54]</w:t>
+            </w:r>
+          </w:p>
+        </w:tc>
+        <w:tc>
+          <w:tcPr>
+            <w:tcW w:type="dxa" w:w="1296"/>
+          </w:tcPr>
+          <w:p>
+            <w:pPr>
+              <w:spacing w:line="240" w:lineRule="auto"/>
+              <w:jc w:val="center"/>
+            </w:pPr>
+            <w:r>
+              <w:rPr>
+                <w:rFonts w:ascii="바탕" w:hAnsi="바탕" w:eastAsia="바탕"/>
+                <w:b w:val="0"/>
+                <w:i w:val="0"/>
+                <w:sz w:val="18"/>
+              </w:rPr>
+              <w:t>-131 [-133, -129]</w:t>
+            </w:r>
+          </w:p>
+        </w:tc>
+      </w:tr>
+      <w:tr>
+        <w:tc>
+          <w:tcPr>
+            <w:tcW w:type="dxa" w:w="1296"/>
+          </w:tcPr>
+          <w:p>
+            <w:pPr>
+              <w:spacing w:line="240" w:lineRule="auto"/>
+              <w:jc w:val="left"/>
+            </w:pPr>
+            <w:r>
+              <w:rPr>
+                <w:rFonts w:ascii="바탕" w:hAnsi="바탕" w:eastAsia="바탕"/>
+                <w:b/>
+                <w:i w:val="0"/>
+                <w:sz w:val="18"/>
+              </w:rPr>
+              <w:t>1.6</w:t>
+            </w:r>
+          </w:p>
+        </w:tc>
+        <w:tc>
+          <w:tcPr>
+            <w:tcW w:type="dxa" w:w="1296"/>
+          </w:tcPr>
+          <w:p>
+            <w:pPr>
+              <w:spacing w:line="240" w:lineRule="auto"/>
+              <w:jc w:val="center"/>
+            </w:pPr>
+            <w:r>
+              <w:rPr>
+                <w:rFonts w:ascii="바탕" w:hAnsi="바탕" w:eastAsia="바탕"/>
+                <w:b w:val="0"/>
+                <w:i w:val="0"/>
+                <w:sz w:val="18"/>
+              </w:rPr>
+              <w:t>—</w:t>
+            </w:r>
+          </w:p>
+        </w:tc>
+        <w:tc>
+          <w:tcPr>
+            <w:tcW w:type="dxa" w:w="1296"/>
+          </w:tcPr>
+          <w:p>
+            <w:pPr>
+              <w:spacing w:line="240" w:lineRule="auto"/>
+              <w:jc w:val="center"/>
+            </w:pPr>
+            <w:r>
+              <w:rPr>
+                <w:rFonts w:ascii="바탕" w:hAnsi="바탕" w:eastAsia="바탕"/>
+                <w:b w:val="0"/>
+                <w:i w:val="0"/>
+                <w:sz w:val="18"/>
+              </w:rPr>
+              <w:t>—</w:t>
+            </w:r>
+          </w:p>
+        </w:tc>
+        <w:tc>
+          <w:tcPr>
+            <w:tcW w:type="dxa" w:w="1296"/>
+          </w:tcPr>
+          <w:p>
+            <w:pPr>
+              <w:spacing w:line="240" w:lineRule="auto"/>
+              <w:jc w:val="center"/>
+            </w:pPr>
+            <w:r>
+              <w:rPr>
+                <w:rFonts w:ascii="바탕" w:hAnsi="바탕" w:eastAsia="바탕"/>
+                <w:b w:val="0"/>
+                <w:i w:val="0"/>
+                <w:sz w:val="18"/>
+              </w:rPr>
+              <w:t>—</w:t>
+            </w:r>
+          </w:p>
+        </w:tc>
+        <w:tc>
+          <w:tcPr>
+            <w:tcW w:type="dxa" w:w="1296"/>
+          </w:tcPr>
+          <w:p>
+            <w:pPr>
+              <w:spacing w:line="240" w:lineRule="auto"/>
+              <w:jc w:val="center"/>
+            </w:pPr>
+            <w:r>
+              <w:rPr>
+                <w:rFonts w:ascii="바탕" w:hAnsi="바탕" w:eastAsia="바탕"/>
+                <w:b w:val="0"/>
+                <w:i w:val="0"/>
+                <w:sz w:val="18"/>
+              </w:rPr>
+              <w:t>-158 [-161, -157]</w:t>
+            </w:r>
+          </w:p>
+        </w:tc>
+        <w:tc>
+          <w:tcPr>
+            <w:tcW w:type="dxa" w:w="1296"/>
+          </w:tcPr>
+          <w:p>
+            <w:pPr>
+              <w:spacing w:line="240" w:lineRule="auto"/>
+              <w:jc w:val="center"/>
+            </w:pPr>
+            <w:r>
+              <w:rPr>
+                <w:rFonts w:ascii="바탕" w:hAnsi="바탕" w:eastAsia="바탕"/>
+                <w:b w:val="0"/>
+                <w:i w:val="0"/>
+                <w:sz w:val="18"/>
+              </w:rPr>
+              <w:t>-99 [-106, -90]</w:t>
+            </w:r>
+          </w:p>
+        </w:tc>
+        <w:tc>
+          <w:tcPr>
+            <w:tcW w:type="dxa" w:w="1296"/>
+          </w:tcPr>
+          <w:p>
+            <w:pPr>
+              <w:spacing w:line="240" w:lineRule="auto"/>
+              <w:jc w:val="center"/>
+            </w:pPr>
+            <w:r>
+              <w:rPr>
+                <w:rFonts w:ascii="바탕" w:hAnsi="바탕" w:eastAsia="바탕"/>
+                <w:b w:val="0"/>
+                <w:i w:val="0"/>
+                <w:sz w:val="18"/>
+              </w:rPr>
+              <w:t>-131 [-133, -129]</w:t>
+            </w:r>
+          </w:p>
+        </w:tc>
+      </w:tr>
+      <w:tr>
+        <w:tc>
+          <w:tcPr>
+            <w:tcW w:type="dxa" w:w="1296"/>
+          </w:tcPr>
+          <w:p>
+            <w:pPr>
+              <w:spacing w:line="240" w:lineRule="auto"/>
+              <w:jc w:val="left"/>
+            </w:pPr>
+            <w:r>
+              <w:rPr>
+                <w:rFonts w:ascii="바탕" w:hAnsi="바탕" w:eastAsia="바탕"/>
+                <w:b/>
+                <w:i w:val="0"/>
+                <w:sz w:val="18"/>
+              </w:rPr>
+              <w:t>1.8</w:t>
+            </w:r>
+          </w:p>
+        </w:tc>
+        <w:tc>
+          <w:tcPr>
+            <w:tcW w:type="dxa" w:w="1296"/>
+          </w:tcPr>
+          <w:p>
+            <w:pPr>
+              <w:spacing w:line="240" w:lineRule="auto"/>
+              <w:jc w:val="center"/>
+            </w:pPr>
+            <w:r>
+              <w:rPr>
+                <w:rFonts w:ascii="바탕" w:hAnsi="바탕" w:eastAsia="바탕"/>
+                <w:b w:val="0"/>
+                <w:i w:val="0"/>
+                <w:sz w:val="18"/>
+              </w:rPr>
+              <w:t>—</w:t>
+            </w:r>
+          </w:p>
+        </w:tc>
+        <w:tc>
+          <w:tcPr>
+            <w:tcW w:type="dxa" w:w="1296"/>
+          </w:tcPr>
+          <w:p>
+            <w:pPr>
+              <w:spacing w:line="240" w:lineRule="auto"/>
+              <w:jc w:val="center"/>
+            </w:pPr>
+            <w:r>
+              <w:rPr>
+                <w:rFonts w:ascii="바탕" w:hAnsi="바탕" w:eastAsia="바탕"/>
+                <w:b w:val="0"/>
+                <w:i w:val="0"/>
+                <w:sz w:val="18"/>
+              </w:rPr>
+              <w:t>—</w:t>
+            </w:r>
+          </w:p>
+        </w:tc>
+        <w:tc>
+          <w:tcPr>
+            <w:tcW w:type="dxa" w:w="1296"/>
+          </w:tcPr>
+          <w:p>
+            <w:pPr>
+              <w:spacing w:line="240" w:lineRule="auto"/>
+              <w:jc w:val="center"/>
+            </w:pPr>
+            <w:r>
+              <w:rPr>
+                <w:rFonts w:ascii="바탕" w:hAnsi="바탕" w:eastAsia="바탕"/>
+                <w:b w:val="0"/>
+                <w:i w:val="0"/>
+                <w:sz w:val="18"/>
+              </w:rPr>
+              <w:t>—</w:t>
+            </w:r>
+          </w:p>
+        </w:tc>
+        <w:tc>
+          <w:tcPr>
+            <w:tcW w:type="dxa" w:w="1296"/>
+          </w:tcPr>
+          <w:p>
+            <w:pPr>
+              <w:spacing w:line="240" w:lineRule="auto"/>
+              <w:jc w:val="center"/>
+            </w:pPr>
+            <w:r>
+              <w:rPr>
+                <w:rFonts w:ascii="바탕" w:hAnsi="바탕" w:eastAsia="바탕"/>
+                <w:b w:val="0"/>
+                <w:i w:val="0"/>
+                <w:sz w:val="18"/>
+              </w:rPr>
+              <w:t>-183 [-185, -181]</w:t>
+            </w:r>
+          </w:p>
+        </w:tc>
+        <w:tc>
+          <w:tcPr>
+            <w:tcW w:type="dxa" w:w="1296"/>
+          </w:tcPr>
+          <w:p>
+            <w:pPr>
+              <w:spacing w:line="240" w:lineRule="auto"/>
+              <w:jc w:val="center"/>
+            </w:pPr>
+            <w:r>
+              <w:rPr>
+                <w:rFonts w:ascii="바탕" w:hAnsi="바탕" w:eastAsia="바탕"/>
+                <w:b w:val="0"/>
+                <w:i w:val="0"/>
+                <w:sz w:val="18"/>
+              </w:rPr>
+              <w:t>-131 [-139, -122]</w:t>
+            </w:r>
+          </w:p>
+        </w:tc>
+        <w:tc>
+          <w:tcPr>
+            <w:tcW w:type="dxa" w:w="1296"/>
+          </w:tcPr>
+          <w:p>
+            <w:pPr>
+              <w:spacing w:line="240" w:lineRule="auto"/>
+              <w:jc w:val="center"/>
+            </w:pPr>
+            <w:r>
+              <w:rPr>
+                <w:rFonts w:ascii="바탕" w:hAnsi="바탕" w:eastAsia="바탕"/>
+                <w:b w:val="0"/>
+                <w:i w:val="0"/>
+                <w:sz w:val="18"/>
+              </w:rPr>
+              <w:t>-131 [-133, -129]</w:t>
+            </w:r>
+          </w:p>
+        </w:tc>
+      </w:tr>
+      <w:tr>
+        <w:tc>
+          <w:tcPr>
+            <w:tcW w:type="dxa" w:w="1296"/>
+          </w:tcPr>
+          <w:p>
+            <w:pPr>
+              <w:spacing w:line="240" w:lineRule="auto"/>
+              <w:jc w:val="left"/>
+            </w:pPr>
+            <w:r>
+              <w:rPr>
+                <w:rFonts w:ascii="바탕" w:hAnsi="바탕" w:eastAsia="바탕"/>
+                <w:b/>
+                <w:i w:val="0"/>
+                <w:sz w:val="18"/>
+              </w:rPr>
               <w:t>2</w:t>
             </w:r>
           </w:p>
@@ -12180,6 +12705,148 @@
                 <w:sz w:val="18"/>
               </w:rPr>
               <w:t>-207 [-209, -205]</w:t>
+            </w:r>
+          </w:p>
+        </w:tc>
+        <w:tc>
+          <w:tcPr>
+            <w:tcW w:type="dxa" w:w="1296"/>
+          </w:tcPr>
+          <w:p>
+            <w:pPr>
+              <w:spacing w:line="240" w:lineRule="auto"/>
+              <w:jc w:val="center"/>
+            </w:pPr>
+            <w:r>
+              <w:rPr>
+                <w:rFonts w:ascii="바탕" w:hAnsi="바탕" w:eastAsia="바탕"/>
+                <w:b w:val="0"/>
+                <w:i w:val="0"/>
+                <w:sz w:val="18"/>
+              </w:rPr>
+              <w:t>-131 [-133, -129]</w:t>
+            </w:r>
+          </w:p>
+        </w:tc>
+        <w:tc>
+          <w:tcPr>
+            <w:tcW w:type="dxa" w:w="1296"/>
+          </w:tcPr>
+          <w:p>
+            <w:pPr>
+              <w:spacing w:line="240" w:lineRule="auto"/>
+              <w:jc w:val="center"/>
+            </w:pPr>
+            <w:r>
+              <w:rPr>
+                <w:rFonts w:ascii="바탕" w:hAnsi="바탕" w:eastAsia="바탕"/>
+                <w:b w:val="0"/>
+                <w:i w:val="0"/>
+                <w:sz w:val="18"/>
+              </w:rPr>
+              <w:t>-131 [-133, -129]</w:t>
+            </w:r>
+          </w:p>
+        </w:tc>
+      </w:tr>
+      <w:tr>
+        <w:tc>
+          <w:tcPr>
+            <w:tcW w:type="dxa" w:w="1296"/>
+          </w:tcPr>
+          <w:p>
+            <w:pPr>
+              <w:spacing w:line="240" w:lineRule="auto"/>
+              <w:jc w:val="left"/>
+            </w:pPr>
+            <w:r>
+              <w:rPr>
+                <w:rFonts w:ascii="바탕" w:hAnsi="바탕" w:eastAsia="바탕"/>
+                <w:b/>
+                <w:i w:val="0"/>
+                <w:sz w:val="18"/>
+              </w:rPr>
+              <w:t>2.5</w:t>
+            </w:r>
+          </w:p>
+        </w:tc>
+        <w:tc>
+          <w:tcPr>
+            <w:tcW w:type="dxa" w:w="1296"/>
+          </w:tcPr>
+          <w:p>
+            <w:pPr>
+              <w:spacing w:line="240" w:lineRule="auto"/>
+              <w:jc w:val="center"/>
+            </w:pPr>
+            <w:r>
+              <w:rPr>
+                <w:rFonts w:ascii="바탕" w:hAnsi="바탕" w:eastAsia="바탕"/>
+                <w:b w:val="0"/>
+                <w:i w:val="0"/>
+                <w:sz w:val="18"/>
+              </w:rPr>
+              <w:t>—</w:t>
+            </w:r>
+          </w:p>
+        </w:tc>
+        <w:tc>
+          <w:tcPr>
+            <w:tcW w:type="dxa" w:w="1296"/>
+          </w:tcPr>
+          <w:p>
+            <w:pPr>
+              <w:spacing w:line="240" w:lineRule="auto"/>
+              <w:jc w:val="center"/>
+            </w:pPr>
+            <w:r>
+              <w:rPr>
+                <w:rFonts w:ascii="바탕" w:hAnsi="바탕" w:eastAsia="바탕"/>
+                <w:b w:val="0"/>
+                <w:i w:val="0"/>
+                <w:sz w:val="18"/>
+              </w:rPr>
+              <w:t>—</w:t>
+            </w:r>
+          </w:p>
+        </w:tc>
+        <w:tc>
+          <w:tcPr>
+            <w:tcW w:type="dxa" w:w="1296"/>
+          </w:tcPr>
+          <w:p>
+            <w:pPr>
+              <w:spacing w:line="240" w:lineRule="auto"/>
+              <w:jc w:val="center"/>
+            </w:pPr>
+            <w:r>
+              <w:rPr>
+                <w:rFonts w:ascii="바탕" w:hAnsi="바탕" w:eastAsia="바탕"/>
+                <w:b w:val="0"/>
+                <w:i w:val="0"/>
+                <w:sz w:val="18"/>
+              </w:rPr>
+              <w:t>—</w:t>
+            </w:r>
+          </w:p>
+        </w:tc>
+        <w:tc>
+          <w:tcPr>
+            <w:tcW w:type="dxa" w:w="1296"/>
+          </w:tcPr>
+          <w:p>
+            <w:pPr>
+              <w:spacing w:line="240" w:lineRule="auto"/>
+              <w:jc w:val="center"/>
+            </w:pPr>
+            <w:r>
+              <w:rPr>
+                <w:rFonts w:ascii="바탕" w:hAnsi="바탕" w:eastAsia="바탕"/>
+                <w:b w:val="0"/>
+                <w:i w:val="0"/>
+                <w:sz w:val="18"/>
+              </w:rPr>
+              <w:t>-267 [-270, -266]</w:t>
             </w:r>
           </w:p>
         </w:tc>
@@ -12487,7 +13154,7 @@
           <w:i w:val="0"/>
           <w:sz w:val="20"/>
         </w:rPr>
-        <w:t>· 표준 DQN은 비교된 λ 구간 전체(8/8 λ)에서 임계값 규칙을 이겼다.</w:t>
+        <w:t>· 표준 DQN은 비교된 λ 구간 전체(8/12 λ)에서 임계값 규칙(처음)을 이겼다.</w:t>
       </w:r>
     </w:p>
     <w:p>
@@ -12502,7 +13169,7 @@
           <w:i w:val="0"/>
           <w:sz w:val="20"/>
         </w:rPr>
-        <w:t>· Lazy-MDP는 비교된 λ 구간 전체(8/8 λ)에서 임계값 규칙을 이겼다.</w:t>
+        <w:t>· Lazy-MDP는 비교된 λ 구간 전체(8/12 λ)에서 임계값 규칙(처음)을 이겼다.</w:t>
       </w:r>
     </w:p>
     <w:p>
@@ -12517,7 +13184,7 @@
           <w:i w:val="0"/>
           <w:sz w:val="20"/>
         </w:rPr>
-        <w:t>· TempoRL은 비교된 λ 구간 전체(8/8 λ)에서 임계값 규칙을 이겼다.</w:t>
+        <w:t>· TempoRL은 비교된 λ 구간 전체(8/12 λ)에서 임계값 규칙(처음)을 이겼다.</w:t>
       </w:r>
     </w:p>
     <w:p>
@@ -12532,7 +13199,7 @@
           <w:i w:val="0"/>
           <w:sz w:val="20"/>
         </w:rPr>
-        <w:t>· λ마다 가장 센 규칙(최강 규칙 포락선)과 비교하면 역전 지점이 앞당겨진다: 표준 DQN λ=2, Lazy-MDP λ=2, TempoRL λ=2. 비용이 커지면 최강 규칙이 무행동으로 바뀌기 때문이며, 이쪽이 실질적인 임계 비용이다.</w:t>
+        <w:t>· λ마다 가장 센 규칙(최강 규칙 포락선)과 비교하면 역전 지점이 앞당겨진다: 표준 DQN λ=1, Lazy-MDP λ=2. 비용이 커지면 최강 규칙이 무행동으로 바뀌기 때문이며, 이쪽이 실질적인 임계 비용이다.</w:t>
       </w:r>
     </w:p>
     <w:p>
@@ -12704,7 +13371,7 @@
                 <w:i w:val="0"/>
                 <w:sz w:val="18"/>
               </w:rPr>
-              <w:t>임계값 규칙</w:t>
+              <w:t>임계값 규칙(처음)</w:t>
             </w:r>
           </w:p>
         </w:tc>
@@ -12870,7 +13537,7 @@
                 <w:i w:val="0"/>
                 <w:sz w:val="18"/>
               </w:rPr>
-              <w:t>121</w:t>
+              <w:t>162</w:t>
             </w:r>
           </w:p>
         </w:tc>
@@ -13012,7 +13679,7 @@
                 <w:i w:val="0"/>
                 <w:sz w:val="18"/>
               </w:rPr>
-              <w:t>121</w:t>
+              <w:t>162</w:t>
             </w:r>
           </w:p>
         </w:tc>
@@ -13154,7 +13821,7 @@
                 <w:i w:val="0"/>
                 <w:sz w:val="18"/>
               </w:rPr>
-              <w:t>121</w:t>
+              <w:t>162</w:t>
             </w:r>
           </w:p>
         </w:tc>
@@ -13296,7 +13963,7 @@
                 <w:i w:val="0"/>
                 <w:sz w:val="18"/>
               </w:rPr>
-              <w:t>121</w:t>
+              <w:t>162</w:t>
             </w:r>
           </w:p>
         </w:tc>
@@ -13438,7 +14105,7 @@
                 <w:i w:val="0"/>
                 <w:sz w:val="18"/>
               </w:rPr>
-              <w:t>121</w:t>
+              <w:t>162</w:t>
             </w:r>
           </w:p>
         </w:tc>
@@ -13480,7 +14147,7 @@
                 <w:i w:val="0"/>
                 <w:sz w:val="18"/>
               </w:rPr>
-              <w:t>1.37</w:t>
+              <w:t>1.2</w:t>
             </w:r>
           </w:p>
         </w:tc>
@@ -13500,7 +14167,7 @@
                 <w:i w:val="0"/>
                 <w:sz w:val="18"/>
               </w:rPr>
-              <w:t>149</w:t>
+              <w:t>—</w:t>
             </w:r>
           </w:p>
         </w:tc>
@@ -13520,7 +14187,7 @@
                 <w:i w:val="0"/>
                 <w:sz w:val="18"/>
               </w:rPr>
-              <w:t>135</w:t>
+              <w:t>—</w:t>
             </w:r>
           </w:p>
         </w:tc>
@@ -13540,7 +14207,7 @@
                 <w:i w:val="0"/>
                 <w:sz w:val="18"/>
               </w:rPr>
-              <w:t>119</w:t>
+              <w:t>—</w:t>
             </w:r>
           </w:p>
         </w:tc>
@@ -13580,7 +14247,7 @@
                 <w:i w:val="0"/>
                 <w:sz w:val="18"/>
               </w:rPr>
-              <w:t>121</w:t>
+              <w:t>162</w:t>
             </w:r>
           </w:p>
         </w:tc>
@@ -13622,6 +14289,432 @@
                 <w:i w:val="0"/>
                 <w:sz w:val="18"/>
               </w:rPr>
+              <w:t>1.37</w:t>
+            </w:r>
+          </w:p>
+        </w:tc>
+        <w:tc>
+          <w:tcPr>
+            <w:tcW w:type="dxa" w:w="1296"/>
+          </w:tcPr>
+          <w:p>
+            <w:pPr>
+              <w:spacing w:line="240" w:lineRule="auto"/>
+              <w:jc w:val="center"/>
+            </w:pPr>
+            <w:r>
+              <w:rPr>
+                <w:rFonts w:ascii="바탕" w:hAnsi="바탕" w:eastAsia="바탕"/>
+                <w:b w:val="0"/>
+                <w:i w:val="0"/>
+                <w:sz w:val="18"/>
+              </w:rPr>
+              <w:t>149</w:t>
+            </w:r>
+          </w:p>
+        </w:tc>
+        <w:tc>
+          <w:tcPr>
+            <w:tcW w:type="dxa" w:w="1296"/>
+          </w:tcPr>
+          <w:p>
+            <w:pPr>
+              <w:spacing w:line="240" w:lineRule="auto"/>
+              <w:jc w:val="center"/>
+            </w:pPr>
+            <w:r>
+              <w:rPr>
+                <w:rFonts w:ascii="바탕" w:hAnsi="바탕" w:eastAsia="바탕"/>
+                <w:b w:val="0"/>
+                <w:i w:val="0"/>
+                <w:sz w:val="18"/>
+              </w:rPr>
+              <w:t>135</w:t>
+            </w:r>
+          </w:p>
+        </w:tc>
+        <w:tc>
+          <w:tcPr>
+            <w:tcW w:type="dxa" w:w="1296"/>
+          </w:tcPr>
+          <w:p>
+            <w:pPr>
+              <w:spacing w:line="240" w:lineRule="auto"/>
+              <w:jc w:val="center"/>
+            </w:pPr>
+            <w:r>
+              <w:rPr>
+                <w:rFonts w:ascii="바탕" w:hAnsi="바탕" w:eastAsia="바탕"/>
+                <w:b w:val="0"/>
+                <w:i w:val="0"/>
+                <w:sz w:val="18"/>
+              </w:rPr>
+              <w:t>119</w:t>
+            </w:r>
+          </w:p>
+        </w:tc>
+        <w:tc>
+          <w:tcPr>
+            <w:tcW w:type="dxa" w:w="1296"/>
+          </w:tcPr>
+          <w:p>
+            <w:pPr>
+              <w:spacing w:line="240" w:lineRule="auto"/>
+              <w:jc w:val="center"/>
+            </w:pPr>
+            <w:r>
+              <w:rPr>
+                <w:rFonts w:ascii="바탕" w:hAnsi="바탕" w:eastAsia="바탕"/>
+                <w:b w:val="0"/>
+                <w:i w:val="0"/>
+                <w:sz w:val="18"/>
+              </w:rPr>
+              <w:t>121</w:t>
+            </w:r>
+          </w:p>
+        </w:tc>
+        <w:tc>
+          <w:tcPr>
+            <w:tcW w:type="dxa" w:w="1296"/>
+          </w:tcPr>
+          <w:p>
+            <w:pPr>
+              <w:spacing w:line="240" w:lineRule="auto"/>
+              <w:jc w:val="center"/>
+            </w:pPr>
+            <w:r>
+              <w:rPr>
+                <w:rFonts w:ascii="바탕" w:hAnsi="바탕" w:eastAsia="바탕"/>
+                <w:b w:val="0"/>
+                <w:i w:val="0"/>
+                <w:sz w:val="18"/>
+              </w:rPr>
+              <w:t>162</w:t>
+            </w:r>
+          </w:p>
+        </w:tc>
+        <w:tc>
+          <w:tcPr>
+            <w:tcW w:type="dxa" w:w="1296"/>
+          </w:tcPr>
+          <w:p>
+            <w:pPr>
+              <w:spacing w:line="240" w:lineRule="auto"/>
+              <w:jc w:val="center"/>
+            </w:pPr>
+            <w:r>
+              <w:rPr>
+                <w:rFonts w:ascii="바탕" w:hAnsi="바탕" w:eastAsia="바탕"/>
+                <w:b w:val="0"/>
+                <w:i w:val="0"/>
+                <w:sz w:val="18"/>
+              </w:rPr>
+              <w:t>0</w:t>
+            </w:r>
+          </w:p>
+        </w:tc>
+      </w:tr>
+      <w:tr>
+        <w:tc>
+          <w:tcPr>
+            <w:tcW w:type="dxa" w:w="1296"/>
+          </w:tcPr>
+          <w:p>
+            <w:pPr>
+              <w:spacing w:line="240" w:lineRule="auto"/>
+              <w:jc w:val="left"/>
+            </w:pPr>
+            <w:r>
+              <w:rPr>
+                <w:rFonts w:ascii="바탕" w:hAnsi="바탕" w:eastAsia="바탕"/>
+                <w:b/>
+                <w:i w:val="0"/>
+                <w:sz w:val="18"/>
+              </w:rPr>
+              <w:t>1.6</w:t>
+            </w:r>
+          </w:p>
+        </w:tc>
+        <w:tc>
+          <w:tcPr>
+            <w:tcW w:type="dxa" w:w="1296"/>
+          </w:tcPr>
+          <w:p>
+            <w:pPr>
+              <w:spacing w:line="240" w:lineRule="auto"/>
+              <w:jc w:val="center"/>
+            </w:pPr>
+            <w:r>
+              <w:rPr>
+                <w:rFonts w:ascii="바탕" w:hAnsi="바탕" w:eastAsia="바탕"/>
+                <w:b w:val="0"/>
+                <w:i w:val="0"/>
+                <w:sz w:val="18"/>
+              </w:rPr>
+              <w:t>—</w:t>
+            </w:r>
+          </w:p>
+        </w:tc>
+        <w:tc>
+          <w:tcPr>
+            <w:tcW w:type="dxa" w:w="1296"/>
+          </w:tcPr>
+          <w:p>
+            <w:pPr>
+              <w:spacing w:line="240" w:lineRule="auto"/>
+              <w:jc w:val="center"/>
+            </w:pPr>
+            <w:r>
+              <w:rPr>
+                <w:rFonts w:ascii="바탕" w:hAnsi="바탕" w:eastAsia="바탕"/>
+                <w:b w:val="0"/>
+                <w:i w:val="0"/>
+                <w:sz w:val="18"/>
+              </w:rPr>
+              <w:t>—</w:t>
+            </w:r>
+          </w:p>
+        </w:tc>
+        <w:tc>
+          <w:tcPr>
+            <w:tcW w:type="dxa" w:w="1296"/>
+          </w:tcPr>
+          <w:p>
+            <w:pPr>
+              <w:spacing w:line="240" w:lineRule="auto"/>
+              <w:jc w:val="center"/>
+            </w:pPr>
+            <w:r>
+              <w:rPr>
+                <w:rFonts w:ascii="바탕" w:hAnsi="바탕" w:eastAsia="바탕"/>
+                <w:b w:val="0"/>
+                <w:i w:val="0"/>
+                <w:sz w:val="18"/>
+              </w:rPr>
+              <w:t>—</w:t>
+            </w:r>
+          </w:p>
+        </w:tc>
+        <w:tc>
+          <w:tcPr>
+            <w:tcW w:type="dxa" w:w="1296"/>
+          </w:tcPr>
+          <w:p>
+            <w:pPr>
+              <w:spacing w:line="240" w:lineRule="auto"/>
+              <w:jc w:val="center"/>
+            </w:pPr>
+            <w:r>
+              <w:rPr>
+                <w:rFonts w:ascii="바탕" w:hAnsi="바탕" w:eastAsia="바탕"/>
+                <w:b w:val="0"/>
+                <w:i w:val="0"/>
+                <w:sz w:val="18"/>
+              </w:rPr>
+              <w:t>121</w:t>
+            </w:r>
+          </w:p>
+        </w:tc>
+        <w:tc>
+          <w:tcPr>
+            <w:tcW w:type="dxa" w:w="1296"/>
+          </w:tcPr>
+          <w:p>
+            <w:pPr>
+              <w:spacing w:line="240" w:lineRule="auto"/>
+              <w:jc w:val="center"/>
+            </w:pPr>
+            <w:r>
+              <w:rPr>
+                <w:rFonts w:ascii="바탕" w:hAnsi="바탕" w:eastAsia="바탕"/>
+                <w:b w:val="0"/>
+                <w:i w:val="0"/>
+                <w:sz w:val="18"/>
+              </w:rPr>
+              <w:t>162</w:t>
+            </w:r>
+          </w:p>
+        </w:tc>
+        <w:tc>
+          <w:tcPr>
+            <w:tcW w:type="dxa" w:w="1296"/>
+          </w:tcPr>
+          <w:p>
+            <w:pPr>
+              <w:spacing w:line="240" w:lineRule="auto"/>
+              <w:jc w:val="center"/>
+            </w:pPr>
+            <w:r>
+              <w:rPr>
+                <w:rFonts w:ascii="바탕" w:hAnsi="바탕" w:eastAsia="바탕"/>
+                <w:b w:val="0"/>
+                <w:i w:val="0"/>
+                <w:sz w:val="18"/>
+              </w:rPr>
+              <w:t>0</w:t>
+            </w:r>
+          </w:p>
+        </w:tc>
+      </w:tr>
+      <w:tr>
+        <w:tc>
+          <w:tcPr>
+            <w:tcW w:type="dxa" w:w="1296"/>
+          </w:tcPr>
+          <w:p>
+            <w:pPr>
+              <w:spacing w:line="240" w:lineRule="auto"/>
+              <w:jc w:val="left"/>
+            </w:pPr>
+            <w:r>
+              <w:rPr>
+                <w:rFonts w:ascii="바탕" w:hAnsi="바탕" w:eastAsia="바탕"/>
+                <w:b/>
+                <w:i w:val="0"/>
+                <w:sz w:val="18"/>
+              </w:rPr>
+              <w:t>1.8</w:t>
+            </w:r>
+          </w:p>
+        </w:tc>
+        <w:tc>
+          <w:tcPr>
+            <w:tcW w:type="dxa" w:w="1296"/>
+          </w:tcPr>
+          <w:p>
+            <w:pPr>
+              <w:spacing w:line="240" w:lineRule="auto"/>
+              <w:jc w:val="center"/>
+            </w:pPr>
+            <w:r>
+              <w:rPr>
+                <w:rFonts w:ascii="바탕" w:hAnsi="바탕" w:eastAsia="바탕"/>
+                <w:b w:val="0"/>
+                <w:i w:val="0"/>
+                <w:sz w:val="18"/>
+              </w:rPr>
+              <w:t>—</w:t>
+            </w:r>
+          </w:p>
+        </w:tc>
+        <w:tc>
+          <w:tcPr>
+            <w:tcW w:type="dxa" w:w="1296"/>
+          </w:tcPr>
+          <w:p>
+            <w:pPr>
+              <w:spacing w:line="240" w:lineRule="auto"/>
+              <w:jc w:val="center"/>
+            </w:pPr>
+            <w:r>
+              <w:rPr>
+                <w:rFonts w:ascii="바탕" w:hAnsi="바탕" w:eastAsia="바탕"/>
+                <w:b w:val="0"/>
+                <w:i w:val="0"/>
+                <w:sz w:val="18"/>
+              </w:rPr>
+              <w:t>—</w:t>
+            </w:r>
+          </w:p>
+        </w:tc>
+        <w:tc>
+          <w:tcPr>
+            <w:tcW w:type="dxa" w:w="1296"/>
+          </w:tcPr>
+          <w:p>
+            <w:pPr>
+              <w:spacing w:line="240" w:lineRule="auto"/>
+              <w:jc w:val="center"/>
+            </w:pPr>
+            <w:r>
+              <w:rPr>
+                <w:rFonts w:ascii="바탕" w:hAnsi="바탕" w:eastAsia="바탕"/>
+                <w:b w:val="0"/>
+                <w:i w:val="0"/>
+                <w:sz w:val="18"/>
+              </w:rPr>
+              <w:t>—</w:t>
+            </w:r>
+          </w:p>
+        </w:tc>
+        <w:tc>
+          <w:tcPr>
+            <w:tcW w:type="dxa" w:w="1296"/>
+          </w:tcPr>
+          <w:p>
+            <w:pPr>
+              <w:spacing w:line="240" w:lineRule="auto"/>
+              <w:jc w:val="center"/>
+            </w:pPr>
+            <w:r>
+              <w:rPr>
+                <w:rFonts w:ascii="바탕" w:hAnsi="바탕" w:eastAsia="바탕"/>
+                <w:b w:val="0"/>
+                <w:i w:val="0"/>
+                <w:sz w:val="18"/>
+              </w:rPr>
+              <w:t>121</w:t>
+            </w:r>
+          </w:p>
+        </w:tc>
+        <w:tc>
+          <w:tcPr>
+            <w:tcW w:type="dxa" w:w="1296"/>
+          </w:tcPr>
+          <w:p>
+            <w:pPr>
+              <w:spacing w:line="240" w:lineRule="auto"/>
+              <w:jc w:val="center"/>
+            </w:pPr>
+            <w:r>
+              <w:rPr>
+                <w:rFonts w:ascii="바탕" w:hAnsi="바탕" w:eastAsia="바탕"/>
+                <w:b w:val="0"/>
+                <w:i w:val="0"/>
+                <w:sz w:val="18"/>
+              </w:rPr>
+              <w:t>162</w:t>
+            </w:r>
+          </w:p>
+        </w:tc>
+        <w:tc>
+          <w:tcPr>
+            <w:tcW w:type="dxa" w:w="1296"/>
+          </w:tcPr>
+          <w:p>
+            <w:pPr>
+              <w:spacing w:line="240" w:lineRule="auto"/>
+              <w:jc w:val="center"/>
+            </w:pPr>
+            <w:r>
+              <w:rPr>
+                <w:rFonts w:ascii="바탕" w:hAnsi="바탕" w:eastAsia="바탕"/>
+                <w:b w:val="0"/>
+                <w:i w:val="0"/>
+                <w:sz w:val="18"/>
+              </w:rPr>
+              <w:t>0</w:t>
+            </w:r>
+          </w:p>
+        </w:tc>
+      </w:tr>
+      <w:tr>
+        <w:tc>
+          <w:tcPr>
+            <w:tcW w:type="dxa" w:w="1296"/>
+          </w:tcPr>
+          <w:p>
+            <w:pPr>
+              <w:spacing w:line="240" w:lineRule="auto"/>
+              <w:jc w:val="left"/>
+            </w:pPr>
+            <w:r>
+              <w:rPr>
+                <w:rFonts w:ascii="바탕" w:hAnsi="바탕" w:eastAsia="바탕"/>
+                <w:b/>
+                <w:i w:val="0"/>
+                <w:sz w:val="18"/>
+              </w:rPr>
               <w:t>2</w:t>
             </w:r>
           </w:p>
@@ -13683,6 +14776,148 @@
                 <w:sz w:val="18"/>
               </w:rPr>
               <w:t>118</w:t>
+            </w:r>
+          </w:p>
+        </w:tc>
+        <w:tc>
+          <w:tcPr>
+            <w:tcW w:type="dxa" w:w="1296"/>
+          </w:tcPr>
+          <w:p>
+            <w:pPr>
+              <w:spacing w:line="240" w:lineRule="auto"/>
+              <w:jc w:val="center"/>
+            </w:pPr>
+            <w:r>
+              <w:rPr>
+                <w:rFonts w:ascii="바탕" w:hAnsi="바탕" w:eastAsia="바탕"/>
+                <w:b w:val="0"/>
+                <w:i w:val="0"/>
+                <w:sz w:val="18"/>
+              </w:rPr>
+              <w:t>121</w:t>
+            </w:r>
+          </w:p>
+        </w:tc>
+        <w:tc>
+          <w:tcPr>
+            <w:tcW w:type="dxa" w:w="1296"/>
+          </w:tcPr>
+          <w:p>
+            <w:pPr>
+              <w:spacing w:line="240" w:lineRule="auto"/>
+              <w:jc w:val="center"/>
+            </w:pPr>
+            <w:r>
+              <w:rPr>
+                <w:rFonts w:ascii="바탕" w:hAnsi="바탕" w:eastAsia="바탕"/>
+                <w:b w:val="0"/>
+                <w:i w:val="0"/>
+                <w:sz w:val="18"/>
+              </w:rPr>
+              <w:t>0</w:t>
+            </w:r>
+          </w:p>
+        </w:tc>
+        <w:tc>
+          <w:tcPr>
+            <w:tcW w:type="dxa" w:w="1296"/>
+          </w:tcPr>
+          <w:p>
+            <w:pPr>
+              <w:spacing w:line="240" w:lineRule="auto"/>
+              <w:jc w:val="center"/>
+            </w:pPr>
+            <w:r>
+              <w:rPr>
+                <w:rFonts w:ascii="바탕" w:hAnsi="바탕" w:eastAsia="바탕"/>
+                <w:b w:val="0"/>
+                <w:i w:val="0"/>
+                <w:sz w:val="18"/>
+              </w:rPr>
+              <w:t>0</w:t>
+            </w:r>
+          </w:p>
+        </w:tc>
+      </w:tr>
+      <w:tr>
+        <w:tc>
+          <w:tcPr>
+            <w:tcW w:type="dxa" w:w="1296"/>
+          </w:tcPr>
+          <w:p>
+            <w:pPr>
+              <w:spacing w:line="240" w:lineRule="auto"/>
+              <w:jc w:val="left"/>
+            </w:pPr>
+            <w:r>
+              <w:rPr>
+                <w:rFonts w:ascii="바탕" w:hAnsi="바탕" w:eastAsia="바탕"/>
+                <w:b/>
+                <w:i w:val="0"/>
+                <w:sz w:val="18"/>
+              </w:rPr>
+              <w:t>2.5</w:t>
+            </w:r>
+          </w:p>
+        </w:tc>
+        <w:tc>
+          <w:tcPr>
+            <w:tcW w:type="dxa" w:w="1296"/>
+          </w:tcPr>
+          <w:p>
+            <w:pPr>
+              <w:spacing w:line="240" w:lineRule="auto"/>
+              <w:jc w:val="center"/>
+            </w:pPr>
+            <w:r>
+              <w:rPr>
+                <w:rFonts w:ascii="바탕" w:hAnsi="바탕" w:eastAsia="바탕"/>
+                <w:b w:val="0"/>
+                <w:i w:val="0"/>
+                <w:sz w:val="18"/>
+              </w:rPr>
+              <w:t>—</w:t>
+            </w:r>
+          </w:p>
+        </w:tc>
+        <w:tc>
+          <w:tcPr>
+            <w:tcW w:type="dxa" w:w="1296"/>
+          </w:tcPr>
+          <w:p>
+            <w:pPr>
+              <w:spacing w:line="240" w:lineRule="auto"/>
+              <w:jc w:val="center"/>
+            </w:pPr>
+            <w:r>
+              <w:rPr>
+                <w:rFonts w:ascii="바탕" w:hAnsi="바탕" w:eastAsia="바탕"/>
+                <w:b w:val="0"/>
+                <w:i w:val="0"/>
+                <w:sz w:val="18"/>
+              </w:rPr>
+              <w:t>—</w:t>
+            </w:r>
+          </w:p>
+        </w:tc>
+        <w:tc>
+          <w:tcPr>
+            <w:tcW w:type="dxa" w:w="1296"/>
+          </w:tcPr>
+          <w:p>
+            <w:pPr>
+              <w:spacing w:line="240" w:lineRule="auto"/>
+              <w:jc w:val="center"/>
+            </w:pPr>
+            <w:r>
+              <w:rPr>
+                <w:rFonts w:ascii="바탕" w:hAnsi="바탕" w:eastAsia="바탕"/>
+                <w:b w:val="0"/>
+                <w:i w:val="0"/>
+                <w:sz w:val="18"/>
+              </w:rPr>
+              <w:t>—</w:t>
             </w:r>
           </w:p>
         </w:tc>
@@ -14206,7 +15441,7 @@
                 <w:i w:val="0"/>
                 <w:sz w:val="18"/>
               </w:rPr>
-              <w:t>0.003</w:t>
+              <w:t>0.0075</w:t>
             </w:r>
           </w:p>
         </w:tc>
@@ -14308,7 +15543,7 @@
                 <w:i w:val="0"/>
                 <w:sz w:val="18"/>
               </w:rPr>
-              <w:t>0.0075</w:t>
+              <w:t>0.002</w:t>
             </w:r>
           </w:p>
         </w:tc>
@@ -14410,7 +15645,7 @@
                 <w:i w:val="0"/>
                 <w:sz w:val="18"/>
               </w:rPr>
-              <w:t>0.001</w:t>
+              <w:t>0.0075</w:t>
             </w:r>
           </w:p>
         </w:tc>
@@ -15670,7 +16905,7 @@
                 <w:i w:val="0"/>
                 <w:sz w:val="18"/>
               </w:rPr>
-              <w:t>기준: 임계값 규칙 (학습 없음)</w:t>
+              <w:t>기준: 임계값 규칙(처음) (학습 없음)</w:t>
             </w:r>
           </w:p>
         </w:tc>
@@ -15835,7 +17070,7 @@
           <w:i w:val="0"/>
           <w:sz w:val="20"/>
         </w:rPr>
-        <w:t>이 연구는 행동 1번의 비용 λ를 독립 변수로 놓고, 표준 DQN·TempoRL 방식·Lazy-MDP 방식·고정 규칙 네 계열을 같은 환경 스텝 예산과 같은 평가 방식으로 비교했다. 얻은 것은 네 가지다.</w:t>
+        <w:t>이 연구는 행동 1번의 비용 λ를 독립 변수로 놓고, 표준 DQN·TempoRL 방식·Lazy-MDP 방식·고정 규칙 네 계열을 같은 환경 스텝 예산과 같은 평가 방식으로 비교했다. 얻은 것은 다섯 가지다.</w:t>
       </w:r>
     </w:p>
     <w:p>
@@ -15903,7 +17138,7 @@
           <w:i w:val="0"/>
           <w:sz w:val="20"/>
         </w:rPr>
-        <w:t>이었다. 보상이 조밀한 환경에서는 행동이 상당히 비싸질 때까지 학습이 규칙을 이겼고, 보상이 희소하고 이미 좋은 규칙이 있는 환경에서는 비용이 없을 때조차 학습이 규칙을 넘어서지 못했다.</w:t>
+        <w:t>이었다. 보상이 희소하고 이미 좋은 규칙이 있는 환경에서는 비용이 없을 때조차 학습이 규칙을 넘어서지 못했고, 보상이 조밀한 환경에서는 학습이 이기되 방법에 따라 이기는 구간이 크게 달랐다.</w:t>
       </w:r>
     </w:p>
     <w:p>
@@ -15919,7 +17154,7 @@
           <w:i w:val="0"/>
           <w:sz w:val="20"/>
         </w:rPr>
-        <w:t>넷째, 이 결과에 대한 가장 당연한 반론을 먼저 확인했다.</w:t>
+        <w:t>셋째, 결론은 기준선을 얼마나 잘 만들었는지에 달려 있다.</w:t>
       </w:r>
       <w:r>
         <w:rPr>
@@ -15928,7 +17163,7 @@
           <w:i w:val="0"/>
           <w:sz w:val="20"/>
         </w:rPr>
-        <w:t xml:space="preserve"> "규칙에 진 것은 비용 때문이 아니라 학습이 덜 된 탓 아닌가?" 비용이 아예 없는 λ=0 조건에서 학습 예산을 3.3배로 늘리고 탐험 방식을 바꿔 다시 쟀다. 결과는 Ⅳ장 공정성 점검 절에 그대로 실었다. 예산을 늘려도 규칙을 넘어서지 못한다면 그것은 비용에 대한 발견이 아니라 </w:t>
+        <w:t xml:space="preserve"> 이 연구는 양쪽을 각각 의심했다. 학습 쪽은 예산을 3.3배로 늘려도 결론이 바뀌지 않았지만, </w:t>
       </w:r>
       <w:r>
         <w:rPr>
@@ -15937,7 +17172,7 @@
           <w:i w:val="0"/>
           <w:sz w:val="20"/>
         </w:rPr>
-        <w:t>그 환경에서 학습이라는 접근 자체가 열세</w:t>
+        <w:t>규칙 쪽은 계수를 다시 고르는 것만으로 기준선이 38.3점에서 179.8점으로 올랐다</w:t>
       </w:r>
       <w:r>
         <w:rPr>
@@ -15946,7 +17181,16 @@
           <w:i w:val="0"/>
           <w:sz w:val="20"/>
         </w:rPr>
-        <w:t>라는 뜻이며, 이 논문은 그 구분을 흐리지 않고 적었다.</w:t>
+        <w:t xml:space="preserve">(같은 형태의 규칙, 계수만 다름. 튜닝은 평가에 쓰지 않는 에피소드에서 했다). 그 결과 표준 DQN의 λ*가 절반으로 줄고, TempoRL 방식은 비용이 0일 때조차 규칙을 이기지 못하게 되었다. </w:t>
+      </w:r>
+      <w:r>
+        <w:rPr>
+          <w:rFonts w:ascii="바탕" w:hAnsi="바탕" w:eastAsia="바탕"/>
+          <w:b/>
+          <w:i w:val="0"/>
+          <w:sz w:val="20"/>
+        </w:rPr>
+        <w:t>"학습이 단순 규칙을 이긴다"는 주장은 그 '단순 규칙'을 얼마나 성의 있게 만들었는지를 밝히지 않으면 의미가 없다.</w:t>
       </w:r>
     </w:p>
     <w:p>
@@ -15962,7 +17206,7 @@
           <w:i w:val="0"/>
           <w:sz w:val="20"/>
         </w:rPr>
-        <w:t>셋째, 무행동 붕괴가 관찰된다.</w:t>
+        <w:t>다섯째, 이 결과에 대한 가장 당연한 반론을 먼저 확인했다.</w:t>
       </w:r>
       <w:r>
         <w:rPr>
@@ -15971,7 +17215,7 @@
           <w:i w:val="0"/>
           <w:sz w:val="20"/>
         </w:rPr>
-        <w:t xml:space="preserve"> 희소 보상 환경에서는 에피소드 보상의 1% 수준밖에 안 되는 작은 비용만으로도 세 계열 모두 행동을 멈추고 그대로 굳었다. 이것이 "비용을 감안하면 가만히 있는 것이 정말 최적"이어서인지, 아니면 "비용 때문에 목표를 한 번도 보지 못해서"인지를 가르기 위해, 같은 예산 안에서 </w:t>
+        <w:t xml:space="preserve"> "규칙에 진 것은 비용 때문이 아니라 학습이 덜 된 탓 아닌가?" 비용이 아예 없는 λ=0 조건에서 학습 예산을 3.3배로 늘리고 탐험 방식을 바꿔 다시 쟀다. 결과는 Ⅳ장 공정성 점검 절에 그대로 실었다. 예산을 늘려도 규칙을 넘어서지 못한다면 그것은 비용에 대한 발견이 아니라 </w:t>
       </w:r>
       <w:r>
         <w:rPr>
@@ -15980,7 +17224,7 @@
           <w:i w:val="0"/>
           <w:sz w:val="20"/>
         </w:rPr>
-        <w:t>비용을 켜는 시점만 바꾼 대조 조건</w:t>
+        <w:t>그 환경에서 학습이라는 접근 자체가 열세</w:t>
       </w:r>
       <w:r>
         <w:rPr>
@@ -15989,22 +17233,7 @@
           <w:i w:val="0"/>
           <w:sz w:val="20"/>
         </w:rPr>
-        <w:t>을 두었다(Ⅲ장 6.2절). [실험 대기 — 결과 나오면 확정] 결과는 Ⅳ장에 그대로 싣는다.</w:t>
-      </w:r>
-    </w:p>
-    <w:p>
-      <w:pPr>
-        <w:spacing w:line="312" w:lineRule="auto" w:before="200" w:after="80"/>
-        <w:jc w:val="left"/>
-      </w:pPr>
-      <w:r>
-        <w:rPr>
-          <w:rFonts w:ascii="맑은 고딕" w:hAnsi="맑은 고딕" w:eastAsia="맑은 고딕"/>
-          <w:b/>
-          <w:i w:val="0"/>
-          <w:sz w:val="22"/>
-        </w:rPr>
-        <w:t>2. 실무자를 위한 정리</w:t>
+        <w:t>라는 뜻이며, 이 논문은 그 구분을 흐리지 않고 적었다.</w:t>
       </w:r>
     </w:p>
     <w:p>
@@ -16016,44 +17245,53 @@
       <w:r>
         <w:rPr>
           <w:rFonts w:ascii="바탕" w:hAnsi="바탕" w:eastAsia="바탕"/>
+          <w:b/>
+          <w:i w:val="0"/>
+          <w:sz w:val="20"/>
+        </w:rPr>
+        <w:t>넷째, 무행동 붕괴가 관찰된다.</w:t>
+      </w:r>
+      <w:r>
+        <w:rPr>
+          <w:rFonts w:ascii="바탕" w:hAnsi="바탕" w:eastAsia="바탕"/>
           <w:b w:val="0"/>
           <w:i w:val="0"/>
           <w:sz w:val="20"/>
         </w:rPr>
-        <w:t>이 연구의 결과를 현장의 판단 순서로 옮기면 다음과 같다.</w:t>
+        <w:t xml:space="preserve"> 희소 보상 환경에서는 에피소드 보상의 1% 수준밖에 안 되는 작은 비용만으로도 세 계열 모두 행동을 멈추고 그대로 굳었다. 이것이 "비용을 감안하면 가만히 있는 것이 정말 최적"이어서인지, 아니면 "비용 때문에 목표를 한 번도 보지 못해서"인지를 가르기 위해, 같은 예산 안에서 </w:t>
+      </w:r>
+      <w:r>
+        <w:rPr>
+          <w:rFonts w:ascii="바탕" w:hAnsi="바탕" w:eastAsia="바탕"/>
+          <w:b/>
+          <w:i w:val="0"/>
+          <w:sz w:val="20"/>
+        </w:rPr>
+        <w:t>비용을 켜는 시점만 바꾼 대조 조건</w:t>
+      </w:r>
+      <w:r>
+        <w:rPr>
+          <w:rFonts w:ascii="바탕" w:hAnsi="바탕" w:eastAsia="바탕"/>
+          <w:b w:val="0"/>
+          <w:i w:val="0"/>
+          <w:sz w:val="20"/>
+        </w:rPr>
+        <w:t>을 두었다(Ⅲ장 6.2절). [실험 대기 — 결과 나오면 확정] 결과는 Ⅳ장에 그대로 싣는다.</w:t>
       </w:r>
     </w:p>
     <w:p>
       <w:pPr>
-        <w:spacing w:line="480" w:lineRule="auto" w:before="0" w:after="0"/>
-        <w:ind w:left="340" w:hanging="340"/>
+        <w:spacing w:line="312" w:lineRule="auto" w:before="200" w:after="80"/>
+        <w:jc w:val="left"/>
       </w:pPr>
       <w:r>
         <w:rPr>
-          <w:rFonts w:ascii="바탕" w:hAnsi="바탕" w:eastAsia="바탕"/>
-          <w:b w:val="0"/>
-          <w:i w:val="0"/>
-          <w:sz w:val="20"/>
-        </w:rPr>
-        <w:t xml:space="preserve">1. </w:t>
-      </w:r>
-      <w:r>
-        <w:rPr>
-          <w:rFonts w:ascii="바탕" w:hAnsi="바탕" w:eastAsia="바탕"/>
+          <w:rFonts w:ascii="맑은 고딕" w:hAnsi="맑은 고딕" w:eastAsia="맑은 고딕"/>
           <w:b/>
           <w:i w:val="0"/>
-          <w:sz w:val="20"/>
-        </w:rPr>
-        <w:t>먼저 환경을 보라.</w:t>
-      </w:r>
-      <w:r>
-        <w:rPr>
-          <w:rFonts w:ascii="바탕" w:hAnsi="바탕" w:eastAsia="바탕"/>
-          <w:b w:val="0"/>
-          <w:i w:val="0"/>
-          <w:sz w:val="20"/>
-        </w:rPr>
-        <w:t xml:space="preserve"> 보상 신호가 조밀한가? 이미 잘 도는 규칙이 있는가? 보상이 희소하고</w:t>
+          <w:sz w:val="22"/>
+        </w:rPr>
+        <w:t>2. 실무자를 위한 정리</w:t>
       </w:r>
     </w:p>
     <w:p>
@@ -16069,7 +17307,7 @@
           <w:i w:val="0"/>
           <w:sz w:val="20"/>
         </w:rPr>
-        <w:t>좋은 규칙이 있다면, 행동 비용을 재기 전에 이미 답이 정해져 있을 가능성이 높다 — 규칙을 쓰라.</w:t>
+        <w:t>이 연구의 결과를 현장의 판단 순서로 옮기면 다음과 같다.</w:t>
       </w:r>
     </w:p>
     <w:p>
@@ -16084,7 +17322,7 @@
           <w:i w:val="0"/>
           <w:sz w:val="20"/>
         </w:rPr>
-        <w:t xml:space="preserve">2. </w:t>
+        <w:t xml:space="preserve">1. </w:t>
       </w:r>
       <w:r>
         <w:rPr>
@@ -16093,7 +17331,7 @@
           <w:i w:val="0"/>
           <w:sz w:val="20"/>
         </w:rPr>
-        <w:t>학습을 쓰기로 했다면 밑바닥이 있는 구조를 골라라.</w:t>
+        <w:t>먼저 환경을 보라.</w:t>
       </w:r>
       <w:r>
         <w:rPr>
@@ -16102,7 +17340,7 @@
           <w:i w:val="0"/>
           <w:sz w:val="20"/>
         </w:rPr>
-        <w:t xml:space="preserve"> Lazy-MDP 방식은 학습이 실패해도 기본</w:t>
+        <w:t xml:space="preserve"> 보상 신호가 조밀한가? 이미 잘 도는 규칙이 있는가? 보상이 희소하고</w:t>
       </w:r>
     </w:p>
     <w:p>
@@ -16118,7 +17356,7 @@
           <w:i w:val="0"/>
           <w:sz w:val="20"/>
         </w:rPr>
-        <w:t>규칙 수준으로 떨어질 뿐이어서 가장 안정적이었다.</w:t>
+        <w:t>좋은 규칙이 있다면, 행동 비용을 재기 전에 이미 답이 정해져 있을 가능성이 높다 — 규칙을 쓰라.</w:t>
       </w:r>
     </w:p>
     <w:p>
@@ -16133,7 +17371,7 @@
           <w:i w:val="0"/>
           <w:sz w:val="20"/>
         </w:rPr>
-        <w:t xml:space="preserve">3. </w:t>
+        <w:t xml:space="preserve">2. </w:t>
       </w:r>
       <w:r>
         <w:rPr>
@@ -16142,7 +17380,7 @@
           <w:i w:val="0"/>
           <w:sz w:val="20"/>
         </w:rPr>
-        <w:t>비용을 처음부터 물리지 마라.</w:t>
+        <w:t>학습을 쓰기로 했다면 밑바닥이 있는 구조를 골라라.</w:t>
       </w:r>
       <w:r>
         <w:rPr>
@@ -16151,7 +17389,7 @@
           <w:i w:val="0"/>
           <w:sz w:val="20"/>
         </w:rPr>
-        <w:t xml:space="preserve"> 비용 없이 먼저 문제를 풀게 한 뒤 비용을 켜는 편이,</w:t>
+        <w:t xml:space="preserve"> Lazy-MDP 방식은 학습이 실패해도 기본</w:t>
       </w:r>
     </w:p>
     <w:p>
@@ -16167,7 +17405,7 @@
           <w:i w:val="0"/>
           <w:sz w:val="20"/>
         </w:rPr>
-        <w:t>처음부터 비용을 물리는 것보다 낫다. 처음부터 물리면 탐험 자체가 막힌다.</w:t>
+        <w:t>규칙 수준으로 떨어질 뿐이어서 가장 안정적이었고, 잘 만든 규칙과 겨루었을 때도 유일하게 넓은 구간에서 이겼다.</w:t>
       </w:r>
     </w:p>
     <w:p>
@@ -16182,7 +17420,105 @@
           <w:i w:val="0"/>
           <w:sz w:val="20"/>
         </w:rPr>
+        <w:t xml:space="preserve">3. </w:t>
+      </w:r>
+      <w:r>
+        <w:rPr>
+          <w:rFonts w:ascii="바탕" w:hAnsi="바탕" w:eastAsia="바탕"/>
+          <w:b/>
+          <w:i w:val="0"/>
+          <w:sz w:val="20"/>
+        </w:rPr>
+        <w:t>비교 상대인 규칙에도 공을 들여라.</w:t>
+      </w:r>
+      <w:r>
+        <w:rPr>
+          <w:rFonts w:ascii="바탕" w:hAnsi="바탕" w:eastAsia="바탕"/>
+          <w:b w:val="0"/>
+          <w:i w:val="0"/>
+          <w:sz w:val="20"/>
+        </w:rPr>
+        <w:t xml:space="preserve"> 대충 만든 규칙을 이기는 것은 쉽다. 이 연구에서는</w:t>
+      </w:r>
+    </w:p>
+    <w:p>
+      <w:pPr>
+        <w:spacing w:line="480" w:lineRule="auto" w:before="0" w:after="0"/>
+        <w:ind w:firstLine="200"/>
+        <w:jc w:val="both"/>
+      </w:pPr>
+      <w:r>
+        <w:rPr>
+          <w:rFonts w:ascii="바탕" w:hAnsi="바탕" w:eastAsia="바탕"/>
+          <w:b w:val="0"/>
+          <w:i w:val="0"/>
+          <w:sz w:val="20"/>
+        </w:rPr>
+        <w:t>같은 형태의 규칙에서 계수만 다시 골랐을 뿐인데 기준선이 141점 올랐고, 그것만으로 결론이 바뀌었다.</w:t>
+      </w:r>
+    </w:p>
+    <w:p>
+      <w:pPr>
+        <w:spacing w:line="480" w:lineRule="auto" w:before="0" w:after="0"/>
+        <w:ind w:left="340" w:hanging="340"/>
+      </w:pPr>
+      <w:r>
+        <w:rPr>
+          <w:rFonts w:ascii="바탕" w:hAnsi="바탕" w:eastAsia="바탕"/>
+          <w:b w:val="0"/>
+          <w:i w:val="0"/>
+          <w:sz w:val="20"/>
+        </w:rPr>
         <w:t xml:space="preserve">4. </w:t>
+      </w:r>
+      <w:r>
+        <w:rPr>
+          <w:rFonts w:ascii="바탕" w:hAnsi="바탕" w:eastAsia="바탕"/>
+          <w:b/>
+          <w:i w:val="0"/>
+          <w:sz w:val="20"/>
+        </w:rPr>
+        <w:t>비용을 처음부터 물리지 마라.</w:t>
+      </w:r>
+      <w:r>
+        <w:rPr>
+          <w:rFonts w:ascii="바탕" w:hAnsi="바탕" w:eastAsia="바탕"/>
+          <w:b w:val="0"/>
+          <w:i w:val="0"/>
+          <w:sz w:val="20"/>
+        </w:rPr>
+        <w:t xml:space="preserve"> 비용 없이 먼저 문제를 풀게 한 뒤 비용을 켜는 편이,</w:t>
+      </w:r>
+    </w:p>
+    <w:p>
+      <w:pPr>
+        <w:spacing w:line="480" w:lineRule="auto" w:before="0" w:after="0"/>
+        <w:ind w:firstLine="200"/>
+        <w:jc w:val="both"/>
+      </w:pPr>
+      <w:r>
+        <w:rPr>
+          <w:rFonts w:ascii="바탕" w:hAnsi="바탕" w:eastAsia="바탕"/>
+          <w:b w:val="0"/>
+          <w:i w:val="0"/>
+          <w:sz w:val="20"/>
+        </w:rPr>
+        <w:t>처음부터 비용을 물리는 것보다 낫다. 처음부터 물리면 탐험 자체가 막힌다.</w:t>
+      </w:r>
+    </w:p>
+    <w:p>
+      <w:pPr>
+        <w:spacing w:line="480" w:lineRule="auto" w:before="0" w:after="0"/>
+        <w:ind w:left="340" w:hanging="340"/>
+      </w:pPr>
+      <w:r>
+        <w:rPr>
+          <w:rFonts w:ascii="바탕" w:hAnsi="바탕" w:eastAsia="바탕"/>
+          <w:b w:val="0"/>
+          <w:i w:val="0"/>
+          <w:sz w:val="20"/>
+        </w:rPr>
+        <w:t xml:space="preserve">5. </w:t>
       </w:r>
       <w:r>
         <w:rPr>

</xml_diff>

<commit_message>
docs: 분량 34쪽 · compact 32쪽으로 갱신 (MinAtar 반영 후 실측)
MinAtar 절·λ 지도·표 2점이 들어와 31 -> 34쪽이 됐다.
--compact를 실제로 돌려 32쪽(표 13 -> 10점)임을 확인했다.

양식이 '최소 10매 ... 이내로'라 해석이 갈리는데, 34쪽은 '이내로'로 읽으면
크게 초과다. 지도교수 판단이 필요하므로 줄이는 선택지와 실측 절감량을
paper/00_양식-규칙.md에 정리해 두었다.

왜 늘었는지 이력도 적었다: 초안 21쪽 -> 문장 나눔 -> 조판 개선(절약) ->
들여쓰기 2글자(+2) -> 그림 4점 추가 -> MinAtar 절과 표.
</commit_message>
<xml_diff>
--- a/졸업논문_초안v1.docx
+++ b/졸업논문_초안v1.docx
@@ -6598,7 +6598,7 @@
                 <w:i w:val="0"/>
                 <w:sz w:val="18"/>
               </w:rPr>
-              <w:t>7</w:t>
+              <w:t>8</w:t>
             </w:r>
           </w:p>
         </w:tc>
@@ -6743,7 +6743,7 @@
                 <w:i w:val="0"/>
                 <w:sz w:val="18"/>
               </w:rPr>
-              <w:t>6</w:t>
+              <w:t>8</w:t>
             </w:r>
           </w:p>
         </w:tc>
@@ -6888,7 +6888,7 @@
                 <w:i w:val="0"/>
                 <w:sz w:val="18"/>
               </w:rPr>
-              <w:t>6</w:t>
+              <w:t>8</w:t>
             </w:r>
           </w:p>
         </w:tc>
@@ -20270,7 +20270,7 @@
           <w:i w:val="0"/>
           <w:sz w:val="20"/>
         </w:rPr>
-        <w:t xml:space="preserve"> 축에서 앞의 두 환경 사이에 있는 세 번째 경우다. 손으로 짠 신중 규칙이 쓸 만하지만(무행동 0.0점, 매 스텝 주기 9.9점 대비 16.9점) 최적과는 거리가 있어 학습이 이길 여지가 남아 있다. 에피소드가 1000스텝으로 고정돼 행동 비용의 압력이 두 환경보다 뚜렷하다. 조건당 환경 300,000스텝, 학습 계열은 λ 6개(격자 6개 중) · 시드 6~7개까지 완료된 집계다. </w:t>
+        <w:t xml:space="preserve"> 축에서 앞의 두 환경 사이에 있는 세 번째 경우다. 손으로 짠 신중 규칙이 쓸 만하지만(무행동 0.0점, 매 스텝 주기 9.9점 대비 16.9점) 최적과는 거리가 있어 학습이 이길 여지가 남아 있다. 에피소드가 1000스텝으로 고정돼 행동 비용의 압력이 두 환경보다 뚜렷하다. 조건당 환경 300,000스텝, 학습 계열은 λ 6개(격자 6개 중) · 시드 8~9개까지 완료된 집계다. </w:t>
       </w:r>
       <w:r>
         <w:rPr>
@@ -20541,7 +20541,7 @@
                 <w:i w:val="0"/>
                 <w:sz w:val="18"/>
               </w:rPr>
-              <w:t>6.2 [5.1, 7.6]</w:t>
+              <w:t>7.0 [5.5, 8.4]</w:t>
             </w:r>
           </w:p>
         </w:tc>
@@ -20562,7 +20562,7 @@
                 <w:i w:val="0"/>
                 <w:sz w:val="18"/>
               </w:rPr>
-              <w:t>9.0 [8.2, 11.0]</w:t>
+              <w:t>8.8 [7.5, 10.1]</w:t>
             </w:r>
           </w:p>
         </w:tc>
@@ -20583,7 +20583,7 @@
                 <w:i w:val="0"/>
                 <w:sz w:val="18"/>
               </w:rPr>
-              <w:t>14.4 [13.1, 15.3]</w:t>
+              <w:t>14.3 [12.7, 15.2]</w:t>
             </w:r>
           </w:p>
         </w:tc>
@@ -20693,7 +20693,7 @@
                 <w:i w:val="0"/>
                 <w:sz w:val="18"/>
               </w:rPr>
-              <w:t>2.8 [2.0, 4.0]</w:t>
+              <w:t>2.5 [1.7, 3.8]</w:t>
             </w:r>
           </w:p>
         </w:tc>
@@ -20714,7 +20714,7 @@
                 <w:i w:val="0"/>
                 <w:sz w:val="18"/>
               </w:rPr>
-              <w:t>3.2 [1.1, 4.5]</w:t>
+              <w:t>3.2 [0.9, 4.5]</w:t>
             </w:r>
           </w:p>
         </w:tc>
@@ -20735,7 +20735,7 @@
                 <w:i w:val="0"/>
                 <w:sz w:val="18"/>
               </w:rPr>
-              <w:t>12.7 [10.9, 14.1]</w:t>
+              <w:t>12.9 [11.3, 14.7]</w:t>
             </w:r>
           </w:p>
         </w:tc>
@@ -20845,7 +20845,7 @@
                 <w:i w:val="0"/>
                 <w:sz w:val="18"/>
               </w:rPr>
-              <w:t>-0.3 [-1.3, 0.4]</w:t>
+              <w:t>0.0 [-1.0, 0.2]</w:t>
             </w:r>
           </w:p>
         </w:tc>
@@ -20866,7 +20866,7 @@
                 <w:i w:val="0"/>
                 <w:sz w:val="18"/>
               </w:rPr>
-              <w:t>-0.1 [-0.6, 0.4]</w:t>
+              <w:t>0.0 [-0.5, 0.3]</w:t>
             </w:r>
           </w:p>
         </w:tc>
@@ -20887,7 +20887,7 @@
                 <w:i w:val="0"/>
                 <w:sz w:val="18"/>
               </w:rPr>
-              <w:t>10.5 [9.0, 12.3]</w:t>
+              <w:t>11.0 [9.1, 12.5]</w:t>
             </w:r>
           </w:p>
         </w:tc>
@@ -20997,7 +20997,7 @@
                 <w:i w:val="0"/>
                 <w:sz w:val="18"/>
               </w:rPr>
-              <w:t>-0.0 [-0.3, 0.0]</w:t>
+              <w:t>0.0 [-0.2, 0.0]</w:t>
             </w:r>
           </w:p>
         </w:tc>
@@ -21018,7 +21018,7 @@
                 <w:i w:val="0"/>
                 <w:sz w:val="18"/>
               </w:rPr>
-              <w:t>-0.1 [-0.4, -0.0]</w:t>
+              <w:t>-0.0 [-0.2, 0.0]</w:t>
             </w:r>
           </w:p>
         </w:tc>
@@ -21039,7 +21039,7 @@
                 <w:i w:val="0"/>
                 <w:sz w:val="18"/>
               </w:rPr>
-              <w:t>8.3 [6.2, 10.2]</w:t>
+              <w:t>8.1 [6.4, 10.2]</w:t>
             </w:r>
           </w:p>
         </w:tc>
@@ -21170,7 +21170,7 @@
                 <w:i w:val="0"/>
                 <w:sz w:val="18"/>
               </w:rPr>
-              <w:t>-0.0 [-0.3, 0.0]</w:t>
+              <w:t>-0.0 [-0.1, 0.0]</w:t>
             </w:r>
           </w:p>
         </w:tc>
@@ -21191,7 +21191,7 @@
                 <w:i w:val="0"/>
                 <w:sz w:val="18"/>
               </w:rPr>
-              <w:t>2.0 [0.5, 2.9]</w:t>
+              <w:t>2.0 [0.9, 2.7]</w:t>
             </w:r>
           </w:p>
         </w:tc>
@@ -21339,7 +21339,7 @@
                 <w:i w:val="0"/>
                 <w:sz w:val="18"/>
               </w:rPr>
-              <w:t>-0.2 [-0.7, 0.1]</w:t>
+              <w:t>-0.5 [-1.0, 0.0]</w:t>
             </w:r>
           </w:p>
         </w:tc>
@@ -21594,7 +21594,7 @@
           <w:i w:val="0"/>
           <w:sz w:val="20"/>
         </w:rPr>
-        <w:t>· 표준 DQN 798.4회(λ=0) → 0.0회(λ=0.06), 100% 감소</w:t>
+        <w:t>· 표준 DQN 848.6회(λ=0) → 0.0회(λ=0.06), 100% 감소</w:t>
       </w:r>
     </w:p>
     <w:p>
@@ -21609,7 +21609,7 @@
           <w:i w:val="0"/>
           <w:sz w:val="20"/>
         </w:rPr>
-        <w:t>· TempoRL 908.9회(λ=0) → 0.0회(λ=0.06), 100% 감소</w:t>
+        <w:t>· TempoRL 909.1회(λ=0) → 0.0회(λ=0.06), 100% 감소</w:t>
       </w:r>
     </w:p>
     <w:p>
@@ -21624,7 +21624,7 @@
           <w:i w:val="0"/>
           <w:sz w:val="20"/>
         </w:rPr>
-        <w:t>· Lazy-MDP 438.8회(λ=0) → 66.4회(λ=0.06), 85% 감소</w:t>
+        <w:t>· Lazy-MDP 451.6회(λ=0) → 90.0회(λ=0.06), 80% 감소</w:t>
       </w:r>
     </w:p>
     <w:p>
@@ -21886,7 +21886,7 @@
                 <w:i w:val="0"/>
                 <w:sz w:val="18"/>
               </w:rPr>
-              <w:t>798</w:t>
+              <w:t>849</w:t>
             </w:r>
           </w:p>
         </w:tc>
@@ -21928,7 +21928,7 @@
                 <w:i w:val="0"/>
                 <w:sz w:val="18"/>
               </w:rPr>
-              <w:t>439</w:t>
+              <w:t>452</w:t>
             </w:r>
           </w:p>
         </w:tc>
@@ -22038,7 +22038,7 @@
                 <w:i w:val="0"/>
                 <w:sz w:val="18"/>
               </w:rPr>
-              <w:t>717</w:t>
+              <w:t>672</w:t>
             </w:r>
           </w:p>
         </w:tc>
@@ -22080,7 +22080,7 @@
                 <w:i w:val="0"/>
                 <w:sz w:val="18"/>
               </w:rPr>
-              <w:t>400</w:t>
+              <w:t>390</w:t>
             </w:r>
           </w:p>
         </w:tc>
@@ -22190,7 +22190,7 @@
                 <w:i w:val="0"/>
                 <w:sz w:val="18"/>
               </w:rPr>
-              <w:t>177</w:t>
+              <w:t>76</w:t>
             </w:r>
           </w:p>
         </w:tc>
@@ -22211,7 +22211,7 @@
                 <w:i w:val="0"/>
                 <w:sz w:val="18"/>
               </w:rPr>
-              <w:t>577</w:t>
+              <w:t>370</w:t>
             </w:r>
           </w:p>
         </w:tc>
@@ -22232,7 +22232,7 @@
                 <w:i w:val="0"/>
                 <w:sz w:val="18"/>
               </w:rPr>
-              <w:t>336</w:t>
+              <w:t>339</w:t>
             </w:r>
           </w:p>
         </w:tc>
@@ -22363,7 +22363,7 @@
                 <w:i w:val="0"/>
                 <w:sz w:val="18"/>
               </w:rPr>
-              <w:t>7</w:t>
+              <w:t>3</w:t>
             </w:r>
           </w:p>
         </w:tc>
@@ -22384,7 +22384,7 @@
                 <w:i w:val="0"/>
                 <w:sz w:val="18"/>
               </w:rPr>
-              <w:t>298</w:t>
+              <w:t>304</w:t>
             </w:r>
           </w:p>
         </w:tc>
@@ -22494,7 +22494,7 @@
                 <w:i w:val="0"/>
                 <w:sz w:val="18"/>
               </w:rPr>
-              <w:t>1</w:t>
+              <w:t>0</w:t>
             </w:r>
           </w:p>
         </w:tc>
@@ -22515,7 +22515,7 @@
                 <w:i w:val="0"/>
                 <w:sz w:val="18"/>
               </w:rPr>
-              <w:t>1</w:t>
+              <w:t>0</w:t>
             </w:r>
           </w:p>
         </w:tc>
@@ -22684,7 +22684,7 @@
                 <w:i w:val="0"/>
                 <w:sz w:val="18"/>
               </w:rPr>
-              <w:t>66</w:t>
+              <w:t>90</w:t>
             </w:r>
           </w:p>
         </w:tc>
@@ -24051,7 +24051,7 @@
                 <w:i w:val="0"/>
                 <w:sz w:val="18"/>
               </w:rPr>
-              <w:t>7</w:t>
+              <w:t>9</w:t>
             </w:r>
           </w:p>
         </w:tc>
@@ -24071,7 +24071,7 @@
                 <w:i w:val="0"/>
                 <w:sz w:val="18"/>
               </w:rPr>
-              <w:t>6.2</w:t>
+              <w:t>7.0</w:t>
             </w:r>
           </w:p>
         </w:tc>
@@ -24091,7 +24091,7 @@
                 <w:i w:val="0"/>
                 <w:sz w:val="18"/>
               </w:rPr>
-              <w:t>[5.1, 7.6]</w:t>
+              <w:t>[5.5, 8.4]</w:t>
             </w:r>
           </w:p>
         </w:tc>

</xml_diff>